<commit_message>
Herramientas clínicas avanzadas para médicos v3.1
- FODA híbrida: motor matemático selecciona biomarcadores (determinista),
  Claude redacta narrativa personalizada con historia clínica del paciente
- Tendencias longitudinales: nuevo tab exclusivo médico con 4 secciones
  (resumen, biomarcadores, scores por sistema, velocidad de cambio)
- Alertas inteligentes: panel lateral con resumen semanal, priorización
  por urgencia, generación automática al subir/re-analizar estudios
- Panel clínico completo: SOAP + comentarios por biomarcador + aprobar/
  rechazar/modificar protocolo + diagnósticos CIE-10
- Prescripción digital: convertir protocolo IA en receta médica PDF
  con membrete, cédula, clasificación OTC/Rx/Procedimiento y firma
- Doc Preguntas Importantes con respuestas ejecutivas
- Manual Ejecutivo actualizado a v3.1

Co-Authored-By: Claude Opus 4.6 (1M context) <noreply@anthropic.com>
</commit_message>
<xml_diff>
--- a/longevity-ia/docs/LONGEVITY_IA_Manual_Ejecutivo.docx
+++ b/longevity-ia/docs/LONGEVITY_IA_Manual_Ejecutivo.docx
@@ -50,7 +50,7 @@
           <w:sz w:val="22"/>
           <w:szCs w:val="22"/>
         </w:rPr>
-        <w:t xml:space="preserve">Version 3.0 | Marzo 2026</w:t>
+        <w:t xml:space="preserve">Version 3.1 | Marzo 2026</w:t>
       </w:r>
     </w:p>
     <w:p>
@@ -571,7 +571,7 @@
           <w:sz w:val="22"/>
           <w:szCs w:val="22"/>
         </w:rPr>
-        <w:t xml:space="preserve">FODA medica computada programaticamente (no generada por IA) con 11 biomarcadores y evidencia citada</w:t>
+        <w:t xml:space="preserve">FODA medica hibrida v3.0: motor matematico selecciona biomarcadores (determinista), Claude redacta narrativa personalizada con historia clinica del paciente</w:t>
       </w:r>
     </w:p>
     <w:p>
@@ -2737,7 +2737,7 @@
           <w:sz w:val="22"/>
           <w:szCs w:val="22"/>
         </w:rPr>
-        <w:t xml:space="preserve">El dashboard tiene 11 pestanas:</w:t>
+        <w:t xml:space="preserve">El dashboard tiene 12 pestanas (la pestana "Tendencias" es exclusiva para medicos):</w:t>
       </w:r>
     </w:p>
     <w:p>
@@ -3215,6 +3215,44 @@
                 <w:szCs w:val="22"/>
               </w:rPr>
               <w:t xml:space="preserve">Visualizacion de datos clinicos recopilados</w:t>
+            </w:r>
+          </w:p>
+        </w:tc>
+      </w:tr>
+      <w:tr>
+        <w:tc>
+          <w:tcPr>
+            <w:tcW w:type="dxa" w:w="4500"/>
+          </w:tcPr>
+          <w:p>
+            <w:pPr>
+              <w:spacing w:after="40" w:before="40"/>
+            </w:pPr>
+            <w:r>
+              <w:rPr>
+                <w:rFonts w:ascii="Calibri" w:cs="Calibri" w:eastAsia="Calibri" w:hAnsi="Calibri"/>
+                <w:sz w:val="22"/>
+                <w:szCs w:val="22"/>
+              </w:rPr>
+              <w:t xml:space="preserve">Tendencias</w:t>
+            </w:r>
+          </w:p>
+        </w:tc>
+        <w:tc>
+          <w:tcPr>
+            <w:tcW w:type="dxa" w:w="4500"/>
+          </w:tcPr>
+          <w:p>
+            <w:pPr>
+              <w:spacing w:after="40" w:before="40"/>
+            </w:pPr>
+            <w:r>
+              <w:rPr>
+                <w:rFonts w:ascii="Calibri" w:cs="Calibri" w:eastAsia="Calibri" w:hAnsi="Calibri"/>
+                <w:sz w:val="22"/>
+                <w:szCs w:val="22"/>
+              </w:rPr>
+              <w:t xml:space="preserve">Comparacion longitudinal entre analisis: biomarcadores, scores por sistema, velocidad de cambio (solo medicos)</w:t>
             </w:r>
           </w:p>
         </w:tc>
@@ -4122,7 +4160,63 @@
                 <w:sz w:val="22"/>
                 <w:szCs w:val="22"/>
               </w:rPr>
-              <w:t xml:space="preserve">Ver dashboard completo (11 pestanas)</w:t>
+              <w:t xml:space="preserve">Ver dashboard completo (12 pestanas)</w:t>
+            </w:r>
+          </w:p>
+        </w:tc>
+        <w:tc>
+          <w:tcPr>
+            <w:tcW w:type="dxa" w:w="3000"/>
+          </w:tcPr>
+          <w:p>
+            <w:pPr>
+              <w:spacing w:after="40" w:before="40"/>
+            </w:pPr>
+            <w:r>
+              <w:rPr>
+                <w:rFonts w:ascii="Calibri" w:cs="Calibri" w:eastAsia="Calibri" w:hAnsi="Calibri"/>
+                <w:sz w:val="22"/>
+                <w:szCs w:val="22"/>
+              </w:rPr>
+              <w:t xml:space="preserve">Si</w:t>
+            </w:r>
+          </w:p>
+        </w:tc>
+        <w:tc>
+          <w:tcPr>
+            <w:tcW w:type="dxa" w:w="3000"/>
+          </w:tcPr>
+          <w:p>
+            <w:pPr>
+              <w:spacing w:after="40" w:before="40"/>
+            </w:pPr>
+            <w:r>
+              <w:rPr>
+                <w:rFonts w:ascii="Calibri" w:cs="Calibri" w:eastAsia="Calibri" w:hAnsi="Calibri"/>
+                <w:sz w:val="22"/>
+                <w:szCs w:val="22"/>
+              </w:rPr>
+              <w:t xml:space="preserve">Si</w:t>
+            </w:r>
+          </w:p>
+        </w:tc>
+      </w:tr>
+      <w:tr>
+        <w:tc>
+          <w:tcPr>
+            <w:tcW w:type="dxa" w:w="3000"/>
+          </w:tcPr>
+          <w:p>
+            <w:pPr>
+              <w:spacing w:after="40" w:before="40"/>
+            </w:pPr>
+            <w:r>
+              <w:rPr>
+                <w:rFonts w:ascii="Calibri" w:cs="Calibri" w:eastAsia="Calibri" w:hAnsi="Calibri"/>
+                <w:sz w:val="22"/>
+                <w:szCs w:val="22"/>
+              </w:rPr>
+              <w:t xml:space="preserve">Tendencias longitudinales (tab exclusivo)</w:t>
             </w:r>
           </w:p>
         </w:tc>
@@ -5646,7 +5740,444 @@
           <w:sz w:val="24"/>
           <w:szCs w:val="24"/>
         </w:rPr>
-        <w:t xml:space="preserve">4.2.9 Alertas Inteligentes</w:t>
+        <w:t xml:space="preserve">4.2.9 Tendencias Longitudinales (Exclusivo Medico)</w:t>
+      </w:r>
+    </w:p>
+    <w:p>
+      <w:pPr>
+        <w:spacing w:after="60"/>
+      </w:pPr>
+    </w:p>
+    <w:p>
+      <w:pPr>
+        <w:spacing w:after="40" w:before="40"/>
+      </w:pPr>
+      <w:r>
+        <w:rPr>
+          <w:rFonts w:ascii="Calibri" w:cs="Calibri" w:eastAsia="Calibri" w:hAnsi="Calibri"/>
+          <w:sz w:val="22"/>
+          <w:szCs w:val="22"/>
+        </w:rPr>
+        <w:t xml:space="preserve">Dashboard visual que compara biomarcadores entre multiples analisis del mismo paciente. Disponible como tab "Tendencias" en el dashboard (solo visible para medicos). Requiere al menos 2 analisis del paciente.</w:t>
+      </w:r>
+    </w:p>
+    <w:p>
+      <w:pPr>
+        <w:spacing w:after="60"/>
+      </w:pPr>
+    </w:p>
+    <w:p>
+      <w:pPr>
+        <w:spacing w:after="40" w:before="40"/>
+      </w:pPr>
+      <w:r>
+        <w:rPr>
+          <w:rFonts w:ascii="Calibri" w:cs="Calibri" w:eastAsia="Calibri" w:hAnsi="Calibri"/>
+          <w:b/>
+          <w:bCs/>
+          <w:sz w:val="22"/>
+          <w:szCs w:val="22"/>
+        </w:rPr>
+        <w:t xml:space="preserve">4 secciones interactivas:</w:t>
+      </w:r>
+    </w:p>
+    <w:p>
+      <w:pPr>
+        <w:spacing w:after="60"/>
+      </w:pPr>
+    </w:p>
+    <w:tbl>
+      <w:tblPr>
+        <w:tblW w:type="dxa" w:w="9000"/>
+        <w:tblBorders>
+          <w:top w:val="single" w:color="auto" w:sz="4"/>
+          <w:left w:val="single" w:color="auto" w:sz="4"/>
+          <w:bottom w:val="single" w:color="auto" w:sz="4"/>
+          <w:right w:val="single" w:color="auto" w:sz="4"/>
+          <w:insideH w:val="single" w:color="auto" w:sz="4"/>
+          <w:insideV w:val="single" w:color="auto" w:sz="4"/>
+        </w:tblBorders>
+      </w:tblPr>
+      <w:tblGrid>
+        <w:gridCol w:w="100"/>
+        <w:gridCol w:w="100"/>
+      </w:tblGrid>
+      <w:tr>
+        <w:tc>
+          <w:tcPr>
+            <w:tcW w:type="dxa" w:w="4500"/>
+            <w:shd w:fill="050E1B" w:color="FFFFFF"/>
+          </w:tcPr>
+          <w:p>
+            <w:pPr>
+              <w:spacing w:after="40" w:before="40"/>
+            </w:pPr>
+            <w:r>
+              <w:rPr>
+                <w:rFonts w:ascii="Calibri" w:cs="Calibri" w:eastAsia="Calibri" w:hAnsi="Calibri"/>
+                <w:sz w:val="22"/>
+                <w:szCs w:val="22"/>
+              </w:rPr>
+              <w:t xml:space="preserve">Seccion</w:t>
+            </w:r>
+          </w:p>
+        </w:tc>
+        <w:tc>
+          <w:tcPr>
+            <w:tcW w:type="dxa" w:w="4500"/>
+            <w:shd w:fill="050E1B" w:color="FFFFFF"/>
+          </w:tcPr>
+          <w:p>
+            <w:pPr>
+              <w:spacing w:after="40" w:before="40"/>
+            </w:pPr>
+            <w:r>
+              <w:rPr>
+                <w:rFonts w:ascii="Calibri" w:cs="Calibri" w:eastAsia="Calibri" w:hAnsi="Calibri"/>
+                <w:sz w:val="22"/>
+                <w:szCs w:val="22"/>
+              </w:rPr>
+              <w:t xml:space="preserve">Contenido</w:t>
+            </w:r>
+          </w:p>
+        </w:tc>
+      </w:tr>
+      <w:tr>
+        <w:tc>
+          <w:tcPr>
+            <w:tcW w:type="dxa" w:w="4500"/>
+          </w:tcPr>
+          <w:p>
+            <w:pPr>
+              <w:spacing w:after="40" w:before="40"/>
+            </w:pPr>
+            <w:r>
+              <w:rPr>
+                <w:rFonts w:ascii="Calibri" w:cs="Calibri" w:eastAsia="Calibri" w:hAnsi="Calibri"/>
+                <w:sz w:val="22"/>
+                <w:szCs w:val="22"/>
+              </w:rPr>
+              <w:t xml:space="preserve">Resumen</w:t>
+            </w:r>
+          </w:p>
+        </w:tc>
+        <w:tc>
+          <w:tcPr>
+            <w:tcW w:type="dxa" w:w="4500"/>
+          </w:tcPr>
+          <w:p>
+            <w:pPr>
+              <w:spacing w:after="40" w:before="40"/>
+            </w:pPr>
+            <w:r>
+              <w:rPr>
+                <w:rFonts w:ascii="Calibri" w:cs="Calibri" w:eastAsia="Calibri" w:hAnsi="Calibri"/>
+                <w:sz w:val="22"/>
+                <w:szCs w:val="22"/>
+              </w:rPr>
+              <w:t xml:space="preserve">Conteo de biomarcadores mejorando/empeorando/estables, grafica del Score General en linea de tiempo, alertas de velocidad de deterioro</w:t>
+            </w:r>
+          </w:p>
+        </w:tc>
+      </w:tr>
+      <w:tr>
+        <w:tc>
+          <w:tcPr>
+            <w:tcW w:type="dxa" w:w="4500"/>
+          </w:tcPr>
+          <w:p>
+            <w:pPr>
+              <w:spacing w:after="40" w:before="40"/>
+            </w:pPr>
+            <w:r>
+              <w:rPr>
+                <w:rFonts w:ascii="Calibri" w:cs="Calibri" w:eastAsia="Calibri" w:hAnsi="Calibri"/>
+                <w:sz w:val="22"/>
+                <w:szCs w:val="22"/>
+              </w:rPr>
+              <w:t xml:space="preserve">Biomarcadores</w:t>
+            </w:r>
+          </w:p>
+        </w:tc>
+        <w:tc>
+          <w:tcPr>
+            <w:tcW w:type="dxa" w:w="4500"/>
+          </w:tcPr>
+          <w:p>
+            <w:pPr>
+              <w:spacing w:after="40" w:before="40"/>
+            </w:pPr>
+            <w:r>
+              <w:rPr>
+                <w:rFonts w:ascii="Calibri" w:cs="Calibri" w:eastAsia="Calibri" w:hAnsi="Calibri"/>
+                <w:sz w:val="22"/>
+                <w:szCs w:val="22"/>
+              </w:rPr>
+              <w:t xml:space="preserve">Lista expandible de cada biomarcador con mini-grafica de evolucion, delta %, velocidad mensual y proyeccion</w:t>
+            </w:r>
+          </w:p>
+        </w:tc>
+      </w:tr>
+      <w:tr>
+        <w:tc>
+          <w:tcPr>
+            <w:tcW w:type="dxa" w:w="4500"/>
+          </w:tcPr>
+          <w:p>
+            <w:pPr>
+              <w:spacing w:after="40" w:before="40"/>
+            </w:pPr>
+            <w:r>
+              <w:rPr>
+                <w:rFonts w:ascii="Calibri" w:cs="Calibri" w:eastAsia="Calibri" w:hAnsi="Calibri"/>
+                <w:sz w:val="22"/>
+                <w:szCs w:val="22"/>
+              </w:rPr>
+              <w:t xml:space="preserve">Scores por Sistema</w:t>
+            </w:r>
+          </w:p>
+        </w:tc>
+        <w:tc>
+          <w:tcPr>
+            <w:tcW w:type="dxa" w:w="4500"/>
+          </w:tcPr>
+          <w:p>
+            <w:pPr>
+              <w:spacing w:after="40" w:before="40"/>
+            </w:pPr>
+            <w:r>
+              <w:rPr>
+                <w:rFonts w:ascii="Calibri" w:cs="Calibri" w:eastAsia="Calibri" w:hAnsi="Calibri"/>
+                <w:sz w:val="22"/>
+                <w:szCs w:val="22"/>
+              </w:rPr>
+              <w:t xml:space="preserve">Grafica de linea temporal por cada sistema (cardiovascular, metabolico, hepatico, renal, etc.) mostrando la evolucion del score sigmoid</w:t>
+            </w:r>
+          </w:p>
+        </w:tc>
+      </w:tr>
+      <w:tr>
+        <w:tc>
+          <w:tcPr>
+            <w:tcW w:type="dxa" w:w="4500"/>
+          </w:tcPr>
+          <w:p>
+            <w:pPr>
+              <w:spacing w:after="40" w:before="40"/>
+            </w:pPr>
+            <w:r>
+              <w:rPr>
+                <w:rFonts w:ascii="Calibri" w:cs="Calibri" w:eastAsia="Calibri" w:hAnsi="Calibri"/>
+                <w:sz w:val="22"/>
+                <w:szCs w:val="22"/>
+              </w:rPr>
+              <w:t xml:space="preserve">Velocidad de Cambio</w:t>
+            </w:r>
+          </w:p>
+        </w:tc>
+        <w:tc>
+          <w:tcPr>
+            <w:tcW w:type="dxa" w:w="4500"/>
+          </w:tcPr>
+          <w:p>
+            <w:pPr>
+              <w:spacing w:after="40" w:before="40"/>
+            </w:pPr>
+            <w:r>
+              <w:rPr>
+                <w:rFonts w:ascii="Calibri" w:cs="Calibri" w:eastAsia="Calibri" w:hAnsi="Calibri"/>
+                <w:sz w:val="22"/>
+                <w:szCs w:val="22"/>
+              </w:rPr>
+              <w:t xml:space="preserve">Tabla ordenada por tasa de cambio: biomarcadores con mayor velocidad de deterioro primero, con proyeccion de meses hasta nivel critico u optimo</w:t>
+            </w:r>
+          </w:p>
+        </w:tc>
+      </w:tr>
+    </w:tbl>
+    <w:p>
+      <w:pPr>
+        <w:spacing w:after="120"/>
+      </w:pPr>
+    </w:p>
+    <w:p>
+      <w:pPr>
+        <w:spacing w:after="60"/>
+      </w:pPr>
+    </w:p>
+    <w:p>
+      <w:pPr>
+        <w:spacing w:after="40" w:before="40"/>
+      </w:pPr>
+      <w:r>
+        <w:rPr>
+          <w:rFonts w:ascii="Calibri" w:cs="Calibri" w:eastAsia="Calibri" w:hAnsi="Calibri"/>
+          <w:b/>
+          <w:bCs/>
+          <w:sz w:val="22"/>
+          <w:szCs w:val="22"/>
+        </w:rPr>
+        <w:t xml:space="preserve">Alertas de velocidad:</w:t>
+      </w:r>
+    </w:p>
+    <w:p>
+      <w:pPr>
+        <w:pStyle w:val="ListParagraph"/>
+        <w:numPr>
+          <w:ilvl w:val="0"/>
+          <w:numId w:val="1"/>
+        </w:numPr>
+        <w:spacing w:after="40" w:before="40"/>
+      </w:pPr>
+      <w:r>
+        <w:rPr>
+          <w:rFonts w:ascii="Calibri" w:cs="Calibri" w:eastAsia="Calibri" w:hAnsi="Calibri"/>
+          <w:sz w:val="22"/>
+          <w:szCs w:val="22"/>
+        </w:rPr>
+        <w:t xml:space="preserve">Si un biomarcador empeora &gt;10%: alerta warning</w:t>
+      </w:r>
+    </w:p>
+    <w:p>
+      <w:pPr>
+        <w:pStyle w:val="ListParagraph"/>
+        <w:numPr>
+          <w:ilvl w:val="0"/>
+          <w:numId w:val="1"/>
+        </w:numPr>
+        <w:spacing w:after="40" w:before="40"/>
+      </w:pPr>
+      <w:r>
+        <w:rPr>
+          <w:rFonts w:ascii="Calibri" w:cs="Calibri" w:eastAsia="Calibri" w:hAnsi="Calibri"/>
+          <w:sz w:val="22"/>
+          <w:szCs w:val="22"/>
+        </w:rPr>
+        <w:t xml:space="preserve">Si empeora &gt;20%: alerta danger</w:t>
+      </w:r>
+    </w:p>
+    <w:p>
+      <w:pPr>
+        <w:pStyle w:val="ListParagraph"/>
+        <w:numPr>
+          <w:ilvl w:val="0"/>
+          <w:numId w:val="1"/>
+        </w:numPr>
+        <w:spacing w:after="40" w:before="40"/>
+      </w:pPr>
+      <w:r>
+        <w:rPr>
+          <w:rFonts w:ascii="Calibri" w:cs="Calibri" w:eastAsia="Calibri" w:hAnsi="Calibri"/>
+          <w:sz w:val="22"/>
+          <w:szCs w:val="22"/>
+        </w:rPr>
+        <w:t xml:space="preserve">Si la proyeccion lineal indica nivel critico en &lt;12 meses: alerta con mensaje "A este ritmo de deterioro, [biomarcador] llegara a nivel critico en ~X meses"</w:t>
+      </w:r>
+    </w:p>
+    <w:p>
+      <w:pPr>
+        <w:spacing w:after="60"/>
+      </w:pPr>
+    </w:p>
+    <w:p>
+      <w:pPr>
+        <w:spacing w:after="40" w:before="40"/>
+      </w:pPr>
+      <w:r>
+        <w:rPr>
+          <w:rFonts w:ascii="Calibri" w:cs="Calibri" w:eastAsia="Calibri" w:hAnsi="Calibri"/>
+          <w:b/>
+          <w:bCs/>
+          <w:sz w:val="22"/>
+          <w:szCs w:val="22"/>
+        </w:rPr>
+        <w:t xml:space="preserve">Scores por sistema en linea de tiempo:</w:t>
+      </w:r>
+    </w:p>
+    <w:p>
+      <w:pPr>
+        <w:pStyle w:val="ListParagraph"/>
+        <w:numPr>
+          <w:ilvl w:val="0"/>
+          <w:numId w:val="1"/>
+        </w:numPr>
+        <w:spacing w:after="40" w:before="40"/>
+      </w:pPr>
+      <w:r>
+        <w:rPr>
+          <w:rFonts w:ascii="Calibri" w:cs="Calibri" w:eastAsia="Calibri" w:hAnsi="Calibri"/>
+          <w:sz w:val="22"/>
+          <w:szCs w:val="22"/>
+        </w:rPr>
+        <w:t xml:space="preserve">Cada sistema muestra su score (0-100) en cada analisis con grafica de linea</w:t>
+      </w:r>
+    </w:p>
+    <w:p>
+      <w:pPr>
+        <w:pStyle w:val="ListParagraph"/>
+        <w:numPr>
+          <w:ilvl w:val="0"/>
+          <w:numId w:val="1"/>
+        </w:numPr>
+        <w:spacing w:after="40" w:before="40"/>
+      </w:pPr>
+      <w:r>
+        <w:rPr>
+          <w:rFonts w:ascii="Calibri" w:cs="Calibri" w:eastAsia="Calibri" w:hAnsi="Calibri"/>
+          <w:sz w:val="22"/>
+          <w:szCs w:val="22"/>
+        </w:rPr>
+        <w:t xml:space="preserve">Ejemplo: "Cardiovascular: 72 → 68 → 63 en 3 analisis" con indicador de tendencia</w:t>
+      </w:r>
+    </w:p>
+    <w:p>
+      <w:pPr>
+        <w:spacing w:after="60"/>
+      </w:pPr>
+    </w:p>
+    <w:p>
+      <w:pPr>
+        <w:spacing w:after="40" w:before="40"/>
+      </w:pPr>
+      <w:r>
+        <w:rPr>
+          <w:rFonts w:ascii="Calibri" w:cs="Calibri" w:eastAsia="Calibri" w:hAnsi="Calibri"/>
+          <w:b/>
+          <w:bCs/>
+          <w:sz w:val="22"/>
+          <w:szCs w:val="22"/>
+        </w:rPr>
+        <w:t xml:space="preserve">Datos analizados:</w:t>
+      </w:r>
+      <w:r>
+        <w:rPr>
+          <w:rFonts w:ascii="Calibri" w:cs="Calibri" w:eastAsia="Calibri" w:hAnsi="Calibri"/>
+          <w:sz w:val="22"/>
+          <w:szCs w:val="22"/>
+        </w:rPr>
+        <w:t xml:space="preserve"> 24 biomarcadores con rangos optimos de longevidad, delta absoluto, delta porcentual, velocidad de cambio mensual, proyeccion a rango optimo o critico.</w:t>
+      </w:r>
+    </w:p>
+    <w:p>
+      <w:pPr>
+        <w:spacing w:after="60"/>
+      </w:pPr>
+    </w:p>
+    <w:p>
+      <w:pPr>
+        <w:pStyle w:val="Heading3"/>
+        <w:spacing w:after="60" w:before="160"/>
+      </w:pPr>
+      <w:r>
+        <w:rPr>
+          <w:rFonts w:ascii="Calibri" w:cs="Calibri" w:eastAsia="Calibri" w:hAnsi="Calibri"/>
+          <w:b/>
+          <w:bCs/>
+          <w:color w:val="C9A84C"/>
+          <w:sz w:val="24"/>
+          <w:szCs w:val="24"/>
+        </w:rPr>
+        <w:t xml:space="preserve">4.2.10 Alertas Inteligentes</w:t>
       </w:r>
     </w:p>
     <w:p>
@@ -7862,7 +8393,7 @@
           <w:sz w:val="18"/>
           <w:szCs w:val="18"/>
         </w:rPr>
-        <w:t xml:space="preserve">│   │   ├── DashboardTabs.tsx     # Orquestador de 11 pestanas</w:t>
+        <w:t xml:space="preserve">│   │   ├── DashboardTabs.tsx     # Orquestador de 12 pestanas</w:t>
       </w:r>
     </w:p>
     <w:p>
@@ -13545,7 +14076,35 @@
           <w:sz w:val="22"/>
           <w:szCs w:val="22"/>
         </w:rPr>
-        <w:t xml:space="preserve"> Recalcula systemScores, overallScore, longevity_age, FODA y proyeccion con funciones matematicas. Los valores de Claude se sobreescriben con calculos reproducibles y auditables.</w:t>
+        <w:t xml:space="preserve"> Recalcula systemScores, overallScore, longevity_age y proyeccion con funciones matematicas. Los valores de Claude se sobreescriben con calculos reproducibles y auditables.</w:t>
+      </w:r>
+    </w:p>
+    <w:p>
+      <w:pPr>
+        <w:spacing w:after="60"/>
+      </w:pPr>
+    </w:p>
+    <w:p>
+      <w:pPr>
+        <w:spacing w:after="40" w:before="40"/>
+      </w:pPr>
+      <w:r>
+        <w:rPr>
+          <w:rFonts w:ascii="Calibri" w:cs="Calibri" w:eastAsia="Calibri" w:hAnsi="Calibri"/>
+          <w:b/>
+          <w:bCs/>
+          <w:sz w:val="22"/>
+          <w:szCs w:val="22"/>
+        </w:rPr>
+        <w:t xml:space="preserve">Capa 3 — FODA Hibrida (motor + IA):</w:t>
+      </w:r>
+      <w:r>
+        <w:rPr>
+          <w:rFonts w:ascii="Calibri" w:cs="Calibri" w:eastAsia="Calibri" w:hAnsi="Calibri"/>
+          <w:sz w:val="22"/>
+          <w:szCs w:val="22"/>
+        </w:rPr>
+        <w:t xml:space="preserve"> El motor matematico selecciona QUE biomarcadores entran en el FODA y en QUE ORDEN (determinista, basado en scores sigmoid y pesos de mortalidad). Claude redacta el DETALLE NARRATIVO de cada punto, personalizado con la historia clinica del paciente (ejercicio, dieta, antecedentes familiares, medicamentos, sueno, estres). Si no hay historia clinica o Claude falla, se usa FODA estatica con templates de evidencia como fallback.</w:t>
       </w:r>
     </w:p>
     <w:p>
@@ -13820,7 +14379,7 @@
           <w:sz w:val="18"/>
           <w:szCs w:val="18"/>
         </w:rPr>
-        <w:t xml:space="preserve">    │  computeFODA()         → FODA (basado en scores)</w:t>
+        <w:t xml:space="preserve">    │  computeProjection()   → proyeccion (Gompertz)</w:t>
       </w:r>
     </w:p>
     <w:p>
@@ -13835,7 +14394,7 @@
           <w:sz w:val="18"/>
           <w:szCs w:val="18"/>
         </w:rPr>
-        <w:t xml:space="preserve">    │  computeProjection()   → proyeccion (Gompertz)</w:t>
+        <w:t xml:space="preserve">    │  analyzeWearables()    → ajustes por wearables (si hay datos)</w:t>
       </w:r>
     </w:p>
     <w:p>
@@ -13850,7 +14409,7 @@
           <w:sz w:val="18"/>
           <w:szCs w:val="18"/>
         </w:rPr>
-        <w:t xml:space="preserve">    │  analyzeWearables()    → ajustes por wearables (si hay datos)</w:t>
+        <w:t xml:space="preserve">    │  deduplicateProtocol() → eliminar moleculas repetidas</w:t>
       </w:r>
     </w:p>
     <w:p>
@@ -13865,7 +14424,82 @@
           <w:sz w:val="18"/>
           <w:szCs w:val="18"/>
         </w:rPr>
-        <w:t xml:space="preserve">    │  deduplicateProtocol() → eliminar moleculas repetidas</w:t>
+        <w:t xml:space="preserve">    │</w:t>
+      </w:r>
+    </w:p>
+    <w:p>
+      <w:pPr>
+        <w:spacing w:after="20" w:before="20"/>
+        <w:ind w:left="400"/>
+      </w:pPr>
+      <w:r>
+        <w:rPr>
+          <w:rFonts w:ascii="Consolas" w:cs="Consolas" w:eastAsia="Consolas" w:hAnsi="Consolas"/>
+          <w:color w:val="6B6660"/>
+          <w:sz w:val="18"/>
+          <w:szCs w:val="18"/>
+        </w:rPr>
+        <w:t xml:space="preserve">    ▼</w:t>
+      </w:r>
+    </w:p>
+    <w:p>
+      <w:pPr>
+        <w:spacing w:after="20" w:before="20"/>
+        <w:ind w:left="400"/>
+      </w:pPr>
+      <w:r>
+        <w:rPr>
+          <w:rFonts w:ascii="Consolas" w:cs="Consolas" w:eastAsia="Consolas" w:hAnsi="Consolas"/>
+          <w:color w:val="6B6660"/>
+          <w:sz w:val="18"/>
+          <w:szCs w:val="18"/>
+        </w:rPr>
+        <w:t xml:space="preserve">[FODA HIBRIDA]               ← Motor + Claude (~10-15s adicionales)</w:t>
+      </w:r>
+    </w:p>
+    <w:p>
+      <w:pPr>
+        <w:spacing w:after="20" w:before="20"/>
+        <w:ind w:left="400"/>
+      </w:pPr>
+      <w:r>
+        <w:rPr>
+          <w:rFonts w:ascii="Consolas" w:cs="Consolas" w:eastAsia="Consolas" w:hAnsi="Consolas"/>
+          <w:color w:val="6B6660"/>
+          <w:sz w:val="18"/>
+          <w:szCs w:val="18"/>
+        </w:rPr>
+        <w:t xml:space="preserve">    │  computeFODASkeleton() → seleccion determinista de biomarcadores</w:t>
+      </w:r>
+    </w:p>
+    <w:p>
+      <w:pPr>
+        <w:spacing w:after="20" w:before="20"/>
+        <w:ind w:left="400"/>
+      </w:pPr>
+      <w:r>
+        <w:rPr>
+          <w:rFonts w:ascii="Consolas" w:cs="Consolas" w:eastAsia="Consolas" w:hAnsi="Consolas"/>
+          <w:color w:val="6B6660"/>
+          <w:sz w:val="18"/>
+          <w:szCs w:val="18"/>
+        </w:rPr>
+        <w:t xml:space="preserve">    │  enrichFODANarrative() → Claude redacta detalle con historia clinica</w:t>
+      </w:r>
+    </w:p>
+    <w:p>
+      <w:pPr>
+        <w:spacing w:after="20" w:before="20"/>
+        <w:ind w:left="400"/>
+      </w:pPr>
+      <w:r>
+        <w:rPr>
+          <w:rFonts w:ascii="Consolas" w:cs="Consolas" w:eastAsia="Consolas" w:hAnsi="Consolas"/>
+          <w:color w:val="6B6660"/>
+          <w:sz w:val="18"/>
+          <w:szCs w:val="18"/>
+        </w:rPr>
+        <w:t xml:space="preserve">    │  fallback:             → computeFODA() si no hay HC o Claude falla</w:t>
       </w:r>
     </w:p>
     <w:p>
@@ -14123,7 +14757,7 @@
           <w:sz w:val="22"/>
           <w:szCs w:val="22"/>
         </w:rPr>
-        <w:t xml:space="preserve">3. longevity-foda.ts — FODA computada</w:t>
+        <w:t xml:space="preserve">3. longevity-foda.ts — FODA Hibrida (motor + IA)</w:t>
       </w:r>
     </w:p>
     <w:p>
@@ -14141,7 +14775,7 @@
           <w:sz w:val="22"/>
           <w:szCs w:val="22"/>
         </w:rPr>
-        <w:t xml:space="preserve">Base de conocimiento para 11 biomarcadores</w:t>
+        <w:t xml:space="preserve">Base de conocimiento para 11 biomarcadores con pesos de mortalidad</w:t>
       </w:r>
     </w:p>
     <w:p>
@@ -14159,7 +14793,43 @@
           <w:sz w:val="22"/>
           <w:szCs w:val="22"/>
         </w:rPr>
-        <w:t xml:space="preserve">Fortalezas = top 4 biomarcadores score &gt;80 por peso mortalidad</w:t>
+        <w:t xml:space="preserve">Arquitectura de 2 fases:</w:t>
+      </w:r>
+    </w:p>
+    <w:p>
+      <w:pPr>
+        <w:pStyle w:val="ListParagraph"/>
+        <w:numPr>
+          <w:ilvl w:val="1"/>
+          <w:numId w:val="1"/>
+        </w:numPr>
+        <w:spacing w:after="20" w:before="20"/>
+      </w:pPr>
+      <w:r>
+        <w:rPr>
+          <w:rFonts w:ascii="Calibri" w:cs="Calibri" w:eastAsia="Calibri" w:hAnsi="Calibri"/>
+          <w:sz w:val="22"/>
+          <w:szCs w:val="22"/>
+        </w:rPr>
+        <w:t xml:space="preserve">Fase 1 (determinista): computeFODASkeleton() selecciona biomarcadores y orden por score sigmoid + mortalityWeight</w:t>
+      </w:r>
+    </w:p>
+    <w:p>
+      <w:pPr>
+        <w:pStyle w:val="ListParagraph"/>
+        <w:numPr>
+          <w:ilvl w:val="1"/>
+          <w:numId w:val="1"/>
+        </w:numPr>
+        <w:spacing w:after="20" w:before="20"/>
+      </w:pPr>
+      <w:r>
+        <w:rPr>
+          <w:rFonts w:ascii="Calibri" w:cs="Calibri" w:eastAsia="Calibri" w:hAnsi="Calibri"/>
+          <w:sz w:val="22"/>
+          <w:szCs w:val="22"/>
+        </w:rPr>
+        <w:t xml:space="preserve">Fase 2 (narrativa): enrichFODANarrative() en analyzer.ts hace llamada ligera a Claude (~4K tokens, ~10-15s) para redactar detalle personalizado con historia clinica</w:t>
       </w:r>
     </w:p>
     <w:p>
@@ -14177,7 +14847,7 @@
           <w:sz w:val="22"/>
           <w:szCs w:val="22"/>
         </w:rPr>
-        <w:t xml:space="preserve">Debilidades = top 3 biomarcadores score &lt;55</w:t>
+        <w:t xml:space="preserve">Fortalezas = top 4 biomarcadores score &gt;=80 por peso mortalidad</w:t>
       </w:r>
     </w:p>
     <w:p>
@@ -14195,7 +14865,7 @@
           <w:sz w:val="22"/>
           <w:szCs w:val="22"/>
         </w:rPr>
-        <w:t xml:space="preserve">Oportunidades = intervenciones con evidencia nivel 1-2</w:t>
+        <w:t xml:space="preserve">Debilidades = top 3 biomarcadores score &lt;55</w:t>
       </w:r>
     </w:p>
     <w:p>
@@ -14213,7 +14883,61 @@
           <w:sz w:val="22"/>
           <w:szCs w:val="22"/>
         </w:rPr>
+        <w:t xml:space="preserve">Oportunidades = intervenciones con evidencia nivel 1-2</w:t>
+      </w:r>
+    </w:p>
+    <w:p>
+      <w:pPr>
+        <w:pStyle w:val="ListParagraph"/>
+        <w:numPr>
+          <w:ilvl w:val="0"/>
+          <w:numId w:val="1"/>
+        </w:numPr>
+        <w:spacing w:after="40" w:before="40"/>
+      </w:pPr>
+      <w:r>
+        <w:rPr>
+          <w:rFonts w:ascii="Calibri" w:cs="Calibri" w:eastAsia="Calibri" w:hAnsi="Calibri"/>
+          <w:sz w:val="22"/>
+          <w:szCs w:val="22"/>
+        </w:rPr>
         <w:t xml:space="preserve">Amenazas = riesgo proyectado por biomarcador + edad + historia familiar</w:t>
+      </w:r>
+    </w:p>
+    <w:p>
+      <w:pPr>
+        <w:pStyle w:val="ListParagraph"/>
+        <w:numPr>
+          <w:ilvl w:val="0"/>
+          <w:numId w:val="1"/>
+        </w:numPr>
+        <w:spacing w:after="40" w:before="40"/>
+      </w:pPr>
+      <w:r>
+        <w:rPr>
+          <w:rFonts w:ascii="Calibri" w:cs="Calibri" w:eastAsia="Calibri" w:hAnsi="Calibri"/>
+          <w:sz w:val="22"/>
+          <w:szCs w:val="22"/>
+        </w:rPr>
+        <w:t xml:space="preserve">Fallback automatico: si no hay historia clinica o Claude falla, usa computeFODA() con templates estaticos</w:t>
+      </w:r>
+    </w:p>
+    <w:p>
+      <w:pPr>
+        <w:pStyle w:val="ListParagraph"/>
+        <w:numPr>
+          <w:ilvl w:val="0"/>
+          <w:numId w:val="1"/>
+        </w:numPr>
+        <w:spacing w:after="40" w:before="40"/>
+      </w:pPr>
+      <w:r>
+        <w:rPr>
+          <w:rFonts w:ascii="Calibri" w:cs="Calibri" w:eastAsia="Calibri" w:hAnsi="Calibri"/>
+          <w:sz w:val="22"/>
+          <w:szCs w:val="22"/>
+        </w:rPr>
+        <w:t xml:space="preserve">Resultado: seleccion reproducible (siempre los mismos biomarcadores) + redaccion personalizada (diferente para atleta de 30 vs sedentario de 65)</w:t>
       </w:r>
     </w:p>
     <w:p>

</xml_diff>

<commit_message>
Actualizar Manual Ejecutivo a v3.2 con todas las funcionalidades
- Panel clinico del medico: SOAP + biomarcadores + protocolo + CIE-10
- Prescripcion digital: OTC/Rx/Procedimiento con PDF y firma
- Alertas inteligentes: panel lateral con resumen semanal y priorizacion
- Tendencias longitudinales: 4 secciones con graficas recharts
- FODA hibrida: motor selecciona, Claude redacta
- Tabla clinical_notes actualizada con campos completos
- Estructura de archivos actualizada con nuevos componentes
- Tabla de permisos del medico actualizada

Co-Authored-By: Claude Opus 4.6 (1M context) <noreply@anthropic.com>
</commit_message>
<xml_diff>
--- a/longevity-ia/docs/LONGEVITY_IA_Manual_Ejecutivo.docx
+++ b/longevity-ia/docs/LONGEVITY_IA_Manual_Ejecutivo.docx
@@ -50,7 +50,7 @@
           <w:sz w:val="22"/>
           <w:szCs w:val="22"/>
         </w:rPr>
-        <w:t xml:space="preserve">Version 3.1 | Marzo 2026</w:t>
+        <w:t xml:space="preserve">Version 3.2 | Marzo 2026</w:t>
       </w:r>
     </w:p>
     <w:p>
@@ -661,7 +661,7 @@
           <w:sz w:val="22"/>
           <w:szCs w:val="22"/>
         </w:rPr>
-        <w:t xml:space="preserve">Notas clinicas SOAP para medicos con historial auditable</w:t>
+        <w:t xml:space="preserve">Panel clinico del medico: notas SOAP, comentarios por biomarcador, aprobacion/rechazo de protocolo, diagnosticos CIE-10</w:t>
       </w:r>
     </w:p>
     <w:p>
@@ -679,7 +679,43 @@
           <w:sz w:val="22"/>
           <w:szCs w:val="22"/>
         </w:rPr>
-        <w:t xml:space="preserve">Sistema de alertas inteligentes con priorizacion para medicos</w:t>
+        <w:t xml:space="preserve">Prescripcion digital: conversion del protocolo IA en receta medica PDF con membrete, cedula, firma, clasificacion OTC/Rx/Procedimiento</w:t>
+      </w:r>
+    </w:p>
+    <w:p>
+      <w:pPr>
+        <w:pStyle w:val="ListParagraph"/>
+        <w:numPr>
+          <w:ilvl w:val="0"/>
+          <w:numId w:val="1"/>
+        </w:numPr>
+        <w:spacing w:after="40" w:before="40"/>
+      </w:pPr>
+      <w:r>
+        <w:rPr>
+          <w:rFonts w:ascii="Calibri" w:cs="Calibri" w:eastAsia="Calibri" w:hAnsi="Calibri"/>
+          <w:sz w:val="22"/>
+          <w:szCs w:val="22"/>
+        </w:rPr>
+        <w:t xml:space="preserve">Alertas inteligentes con panel lateral, resumen semanal, priorizacion automatica por urgencia</w:t>
+      </w:r>
+    </w:p>
+    <w:p>
+      <w:pPr>
+        <w:pStyle w:val="ListParagraph"/>
+        <w:numPr>
+          <w:ilvl w:val="0"/>
+          <w:numId w:val="1"/>
+        </w:numPr>
+        <w:spacing w:after="40" w:before="40"/>
+      </w:pPr>
+      <w:r>
+        <w:rPr>
+          <w:rFonts w:ascii="Calibri" w:cs="Calibri" w:eastAsia="Calibri" w:hAnsi="Calibri"/>
+          <w:sz w:val="22"/>
+          <w:szCs w:val="22"/>
+        </w:rPr>
+        <w:t xml:space="preserve">Tendencias longitudinales: comparacion entre analisis con graficas de biomarcadores y scores por sistema en linea de tiempo</w:t>
       </w:r>
     </w:p>
     <w:p>
@@ -4272,7 +4308,7 @@
                 <w:sz w:val="22"/>
                 <w:szCs w:val="22"/>
               </w:rPr>
-              <w:t xml:space="preserve">Chatbot Longevity IA</w:t>
+              <w:t xml:space="preserve">Panel clinico (SOAP + biomarcadores + protocolo + CIE-10)</w:t>
             </w:r>
           </w:p>
         </w:tc>
@@ -4328,7 +4364,7 @@
                 <w:sz w:val="22"/>
                 <w:szCs w:val="22"/>
               </w:rPr>
-              <w:t xml:space="preserve">Referencias verificadas (PubMed, Semantic Scholar, OpenAlex)</w:t>
+              <w:t xml:space="preserve">Prescripcion digital PDF</w:t>
             </w:r>
           </w:p>
         </w:tc>
@@ -4384,7 +4420,119 @@
                 <w:sz w:val="22"/>
                 <w:szCs w:val="22"/>
               </w:rPr>
-              <w:t xml:space="preserve">Notas clinicas SOAP</w:t>
+              <w:t xml:space="preserve">Alertas inteligentes</w:t>
+            </w:r>
+          </w:p>
+        </w:tc>
+        <w:tc>
+          <w:tcPr>
+            <w:tcW w:type="dxa" w:w="3000"/>
+          </w:tcPr>
+          <w:p>
+            <w:pPr>
+              <w:spacing w:after="40" w:before="40"/>
+            </w:pPr>
+            <w:r>
+              <w:rPr>
+                <w:rFonts w:ascii="Calibri" w:cs="Calibri" w:eastAsia="Calibri" w:hAnsi="Calibri"/>
+                <w:sz w:val="22"/>
+                <w:szCs w:val="22"/>
+              </w:rPr>
+              <w:t xml:space="preserve">Si</w:t>
+            </w:r>
+          </w:p>
+        </w:tc>
+        <w:tc>
+          <w:tcPr>
+            <w:tcW w:type="dxa" w:w="3000"/>
+          </w:tcPr>
+          <w:p>
+            <w:pPr>
+              <w:spacing w:after="40" w:before="40"/>
+            </w:pPr>
+            <w:r>
+              <w:rPr>
+                <w:rFonts w:ascii="Calibri" w:cs="Calibri" w:eastAsia="Calibri" w:hAnsi="Calibri"/>
+                <w:sz w:val="22"/>
+                <w:szCs w:val="22"/>
+              </w:rPr>
+              <w:t xml:space="preserve">Si</w:t>
+            </w:r>
+          </w:p>
+        </w:tc>
+      </w:tr>
+      <w:tr>
+        <w:tc>
+          <w:tcPr>
+            <w:tcW w:type="dxa" w:w="3000"/>
+          </w:tcPr>
+          <w:p>
+            <w:pPr>
+              <w:spacing w:after="40" w:before="40"/>
+            </w:pPr>
+            <w:r>
+              <w:rPr>
+                <w:rFonts w:ascii="Calibri" w:cs="Calibri" w:eastAsia="Calibri" w:hAnsi="Calibri"/>
+                <w:sz w:val="22"/>
+                <w:szCs w:val="22"/>
+              </w:rPr>
+              <w:t xml:space="preserve">Chatbot Longevity IA</w:t>
+            </w:r>
+          </w:p>
+        </w:tc>
+        <w:tc>
+          <w:tcPr>
+            <w:tcW w:type="dxa" w:w="3000"/>
+          </w:tcPr>
+          <w:p>
+            <w:pPr>
+              <w:spacing w:after="40" w:before="40"/>
+            </w:pPr>
+            <w:r>
+              <w:rPr>
+                <w:rFonts w:ascii="Calibri" w:cs="Calibri" w:eastAsia="Calibri" w:hAnsi="Calibri"/>
+                <w:sz w:val="22"/>
+                <w:szCs w:val="22"/>
+              </w:rPr>
+              <w:t xml:space="preserve">Si</w:t>
+            </w:r>
+          </w:p>
+        </w:tc>
+        <w:tc>
+          <w:tcPr>
+            <w:tcW w:type="dxa" w:w="3000"/>
+          </w:tcPr>
+          <w:p>
+            <w:pPr>
+              <w:spacing w:after="40" w:before="40"/>
+            </w:pPr>
+            <w:r>
+              <w:rPr>
+                <w:rFonts w:ascii="Calibri" w:cs="Calibri" w:eastAsia="Calibri" w:hAnsi="Calibri"/>
+                <w:sz w:val="22"/>
+                <w:szCs w:val="22"/>
+              </w:rPr>
+              <w:t xml:space="preserve">Si</w:t>
+            </w:r>
+          </w:p>
+        </w:tc>
+      </w:tr>
+      <w:tr>
+        <w:tc>
+          <w:tcPr>
+            <w:tcW w:type="dxa" w:w="3000"/>
+          </w:tcPr>
+          <w:p>
+            <w:pPr>
+              <w:spacing w:after="40" w:before="40"/>
+            </w:pPr>
+            <w:r>
+              <w:rPr>
+                <w:rFonts w:ascii="Calibri" w:cs="Calibri" w:eastAsia="Calibri" w:hAnsi="Calibri"/>
+                <w:sz w:val="22"/>
+                <w:szCs w:val="22"/>
+              </w:rPr>
+              <w:t xml:space="preserve">Referencias verificadas (PubMed, Semantic Scholar, OpenAlex)</w:t>
             </w:r>
           </w:p>
         </w:tc>
@@ -4786,7 +4934,45 @@
           <w:sz w:val="24"/>
           <w:szCs w:val="24"/>
         </w:rPr>
-        <w:t xml:space="preserve">4.2.6 Notas Clinicas SOAP</w:t>
+        <w:t xml:space="preserve">4.2.6 Panel Clinico del Medico</w:t>
+      </w:r>
+    </w:p>
+    <w:p>
+      <w:pPr>
+        <w:spacing w:after="60"/>
+      </w:pPr>
+    </w:p>
+    <w:p>
+      <w:pPr>
+        <w:spacing w:after="40" w:before="40"/>
+      </w:pPr>
+      <w:r>
+        <w:rPr>
+          <w:rFonts w:ascii="Calibri" w:cs="Calibri" w:eastAsia="Calibri" w:hAnsi="Calibri"/>
+          <w:sz w:val="22"/>
+          <w:szCs w:val="22"/>
+        </w:rPr>
+        <w:t xml:space="preserve">En el dashboard del paciente (tab Resumen, al fondo), aparece el "Panel Clinico del Medico" con 4 sub-tabs. Todas las notas se guardan en `clinical_notes` (tabla del medico, NO modifica el analisis del paciente). Cada nota tiene timestamp auditable.</w:t>
+      </w:r>
+    </w:p>
+    <w:p>
+      <w:pPr>
+        <w:spacing w:after="60"/>
+      </w:pPr>
+    </w:p>
+    <w:p>
+      <w:pPr>
+        <w:spacing w:after="40" w:before="40"/>
+      </w:pPr>
+      <w:r>
+        <w:rPr>
+          <w:rFonts w:ascii="Calibri" w:cs="Calibri" w:eastAsia="Calibri" w:hAnsi="Calibri"/>
+          <w:b/>
+          <w:bCs/>
+          <w:sz w:val="22"/>
+          <w:szCs w:val="22"/>
+        </w:rPr>
+        <w:t xml:space="preserve">Tab 1: Notas SOAP</w:t>
       </w:r>
     </w:p>
     <w:p>
@@ -4804,7 +4990,7 @@
           <w:sz w:val="22"/>
           <w:szCs w:val="22"/>
         </w:rPr>
-        <w:t xml:space="preserve">En el dashboard del paciente (tab Resumen), aparece el panel "Notas Clinicas"</w:t>
+        <w:t xml:space="preserve">Hacer clic en "Nueva nota SOAP"</w:t>
       </w:r>
     </w:p>
     <w:p>
@@ -4822,7 +5008,7 @@
           <w:sz w:val="22"/>
           <w:szCs w:val="22"/>
         </w:rPr>
-        <w:t xml:space="preserve">Hacer clic en "Nueva nota" para abrir el formulario SOAP:</w:t>
+        <w:t xml:space="preserve">Llenar formulario de 4 campos:</w:t>
       </w:r>
     </w:p>
     <w:p>
@@ -4898,15 +5084,15 @@
           <w:sz w:val="22"/>
           <w:szCs w:val="22"/>
         </w:rPr>
-        <w:t xml:space="preserve">A (Assessment):</w:t>
-      </w:r>
-      <w:r>
-        <w:rPr>
-          <w:rFonts w:ascii="Calibri" w:cs="Calibri" w:eastAsia="Calibri" w:hAnsi="Calibri"/>
-          <w:sz w:val="22"/>
-          <w:szCs w:val="22"/>
-        </w:rPr>
-        <w:t xml:space="preserve"> Evaluacion clinica, diagnosticos</w:t>
+        <w:t xml:space="preserve">A (Evaluacion):</w:t>
+      </w:r>
+      <w:r>
+        <w:rPr>
+          <w:rFonts w:ascii="Calibri" w:cs="Calibri" w:eastAsia="Calibri" w:hAnsi="Calibri"/>
+          <w:sz w:val="22"/>
+          <w:szCs w:val="22"/>
+        </w:rPr>
+        <w:t xml:space="preserve"> Diagnosticos, interpretacion clinica, severidad</w:t>
       </w:r>
     </w:p>
     <w:p>
@@ -4952,7 +5138,27 @@
           <w:sz w:val="22"/>
           <w:szCs w:val="22"/>
         </w:rPr>
-        <w:t xml:space="preserve">Las notas se guardan con timestamp y son visibles solo para el medico que las creo</w:t>
+        <w:t xml:space="preserve">Historial expandible con campos coloreados por tipo</w:t>
+      </w:r>
+    </w:p>
+    <w:p>
+      <w:pPr>
+        <w:spacing w:after="60"/>
+      </w:pPr>
+    </w:p>
+    <w:p>
+      <w:pPr>
+        <w:spacing w:after="40" w:before="40"/>
+      </w:pPr>
+      <w:r>
+        <w:rPr>
+          <w:rFonts w:ascii="Calibri" w:cs="Calibri" w:eastAsia="Calibri" w:hAnsi="Calibri"/>
+          <w:b/>
+          <w:bCs/>
+          <w:sz w:val="22"/>
+          <w:szCs w:val="22"/>
+        </w:rPr>
+        <w:t xml:space="preserve">Tab 2: Comentarios por Biomarcador</w:t>
       </w:r>
     </w:p>
     <w:p>
@@ -4970,7 +5176,335 @@
           <w:sz w:val="22"/>
           <w:szCs w:val="22"/>
         </w:rPr>
-        <w:t xml:space="preserve">Historial de notas expandible con barra de scroll</w:t>
+        <w:t xml:space="preserve">Hacer clic en "Comentar biomarcador"</w:t>
+      </w:r>
+    </w:p>
+    <w:p>
+      <w:pPr>
+        <w:pStyle w:val="ListParagraph"/>
+        <w:numPr>
+          <w:ilvl w:val="0"/>
+          <w:numId w:val="2"/>
+        </w:numPr>
+        <w:spacing w:after="40" w:before="40"/>
+      </w:pPr>
+      <w:r>
+        <w:rPr>
+          <w:rFonts w:ascii="Calibri" w:cs="Calibri" w:eastAsia="Calibri" w:hAnsi="Calibri"/>
+          <w:sz w:val="22"/>
+          <w:szCs w:val="22"/>
+        </w:rPr>
+        <w:t xml:space="preserve">Se muestra un grid visual con TODOS los biomarcadores del analisis actual</w:t>
+      </w:r>
+    </w:p>
+    <w:p>
+      <w:pPr>
+        <w:pStyle w:val="ListParagraph"/>
+        <w:numPr>
+          <w:ilvl w:val="0"/>
+          <w:numId w:val="2"/>
+        </w:numPr>
+        <w:spacing w:after="40" w:before="40"/>
+      </w:pPr>
+      <w:r>
+        <w:rPr>
+          <w:rFonts w:ascii="Calibri" w:cs="Calibri" w:eastAsia="Calibri" w:hAnsi="Calibri"/>
+          <w:sz w:val="22"/>
+          <w:szCs w:val="22"/>
+        </w:rPr>
+        <w:t xml:space="preserve">Cada biomarcador muestra valor, unidad y color por status (danger=rojo, warning=amarillo, optimal=verde)</w:t>
+      </w:r>
+    </w:p>
+    <w:p>
+      <w:pPr>
+        <w:pStyle w:val="ListParagraph"/>
+        <w:numPr>
+          <w:ilvl w:val="0"/>
+          <w:numId w:val="2"/>
+        </w:numPr>
+        <w:spacing w:after="40" w:before="40"/>
+      </w:pPr>
+      <w:r>
+        <w:rPr>
+          <w:rFonts w:ascii="Calibri" w:cs="Calibri" w:eastAsia="Calibri" w:hAnsi="Calibri"/>
+          <w:sz w:val="22"/>
+          <w:szCs w:val="22"/>
+        </w:rPr>
+        <w:t xml:space="preserve">El medico selecciona un biomarcador y escribe comentario clinico</w:t>
+      </w:r>
+    </w:p>
+    <w:p>
+      <w:pPr>
+        <w:pStyle w:val="ListParagraph"/>
+        <w:numPr>
+          <w:ilvl w:val="0"/>
+          <w:numId w:val="2"/>
+        </w:numPr>
+        <w:spacing w:after="40" w:before="40"/>
+      </w:pPr>
+      <w:r>
+        <w:rPr>
+          <w:rFonts w:ascii="Calibri" w:cs="Calibri" w:eastAsia="Calibri" w:hAnsi="Calibri"/>
+          <w:sz w:val="22"/>
+          <w:szCs w:val="22"/>
+        </w:rPr>
+        <w:t xml:space="preserve">Ejemplo: "Este LDL requiere estatina por historia familiar de enfermedad coronaria prematura"</w:t>
+      </w:r>
+    </w:p>
+    <w:p>
+      <w:pPr>
+        <w:spacing w:after="60"/>
+      </w:pPr>
+    </w:p>
+    <w:p>
+      <w:pPr>
+        <w:spacing w:after="40" w:before="40"/>
+      </w:pPr>
+      <w:r>
+        <w:rPr>
+          <w:rFonts w:ascii="Calibri" w:cs="Calibri" w:eastAsia="Calibri" w:hAnsi="Calibri"/>
+          <w:b/>
+          <w:bCs/>
+          <w:sz w:val="22"/>
+          <w:szCs w:val="22"/>
+        </w:rPr>
+        <w:t xml:space="preserve">Tab 3: Revision de Protocolo</w:t>
+      </w:r>
+    </w:p>
+    <w:p>
+      <w:pPr>
+        <w:pStyle w:val="ListParagraph"/>
+        <w:numPr>
+          <w:ilvl w:val="0"/>
+          <w:numId w:val="2"/>
+        </w:numPr>
+        <w:spacing w:after="40" w:before="40"/>
+      </w:pPr>
+      <w:r>
+        <w:rPr>
+          <w:rFonts w:ascii="Calibri" w:cs="Calibri" w:eastAsia="Calibri" w:hAnsi="Calibri"/>
+          <w:sz w:val="22"/>
+          <w:szCs w:val="22"/>
+        </w:rPr>
+        <w:t xml:space="preserve">Hacer clic en "Revisar protocolo"</w:t>
+      </w:r>
+    </w:p>
+    <w:p>
+      <w:pPr>
+        <w:pStyle w:val="ListParagraph"/>
+        <w:numPr>
+          <w:ilvl w:val="0"/>
+          <w:numId w:val="2"/>
+        </w:numPr>
+        <w:spacing w:after="40" w:before="40"/>
+      </w:pPr>
+      <w:r>
+        <w:rPr>
+          <w:rFonts w:ascii="Calibri" w:cs="Calibri" w:eastAsia="Calibri" w:hAnsi="Calibri"/>
+          <w:sz w:val="22"/>
+          <w:szCs w:val="22"/>
+        </w:rPr>
+        <w:t xml:space="preserve">Se listan todas las intervenciones del protocolo de IA</w:t>
+      </w:r>
+    </w:p>
+    <w:p>
+      <w:pPr>
+        <w:pStyle w:val="ListParagraph"/>
+        <w:numPr>
+          <w:ilvl w:val="0"/>
+          <w:numId w:val="2"/>
+        </w:numPr>
+        <w:spacing w:after="40" w:before="40"/>
+      </w:pPr>
+      <w:r>
+        <w:rPr>
+          <w:rFonts w:ascii="Calibri" w:cs="Calibri" w:eastAsia="Calibri" w:hAnsi="Calibri"/>
+          <w:sz w:val="22"/>
+          <w:szCs w:val="22"/>
+        </w:rPr>
+        <w:t xml:space="preserve">Cada molecula tiene 3 botones: Aprobar (verde), Rechazar (rojo), Modificar (amarillo)</w:t>
+      </w:r>
+    </w:p>
+    <w:p>
+      <w:pPr>
+        <w:pStyle w:val="ListParagraph"/>
+        <w:numPr>
+          <w:ilvl w:val="0"/>
+          <w:numId w:val="2"/>
+        </w:numPr>
+        <w:spacing w:after="40" w:before="40"/>
+      </w:pPr>
+      <w:r>
+        <w:rPr>
+          <w:rFonts w:ascii="Calibri" w:cs="Calibri" w:eastAsia="Calibri" w:hAnsi="Calibri"/>
+          <w:sz w:val="22"/>
+          <w:szCs w:val="22"/>
+        </w:rPr>
+        <w:t xml:space="preserve">Al rechazar: campo para escribir la razon</w:t>
+      </w:r>
+    </w:p>
+    <w:p>
+      <w:pPr>
+        <w:pStyle w:val="ListParagraph"/>
+        <w:numPr>
+          <w:ilvl w:val="0"/>
+          <w:numId w:val="2"/>
+        </w:numPr>
+        <w:spacing w:after="40" w:before="40"/>
+      </w:pPr>
+      <w:r>
+        <w:rPr>
+          <w:rFonts w:ascii="Calibri" w:cs="Calibri" w:eastAsia="Calibri" w:hAnsi="Calibri"/>
+          <w:sz w:val="22"/>
+          <w:szCs w:val="22"/>
+        </w:rPr>
+        <w:t xml:space="preserve">Al modificar: campos para nueva dosis + razon</w:t>
+      </w:r>
+    </w:p>
+    <w:p>
+      <w:pPr>
+        <w:pStyle w:val="ListParagraph"/>
+        <w:numPr>
+          <w:ilvl w:val="0"/>
+          <w:numId w:val="2"/>
+        </w:numPr>
+        <w:spacing w:after="40" w:before="40"/>
+      </w:pPr>
+      <w:r>
+        <w:rPr>
+          <w:rFonts w:ascii="Calibri" w:cs="Calibri" w:eastAsia="Calibri" w:hAnsi="Calibri"/>
+          <w:sz w:val="22"/>
+          <w:szCs w:val="22"/>
+        </w:rPr>
+        <w:t xml:space="preserve">Conteo en tiempo real: "3 aprobadas, 1 rechazada, 2 modificadas"</w:t>
+      </w:r>
+    </w:p>
+    <w:p>
+      <w:pPr>
+        <w:pStyle w:val="ListParagraph"/>
+        <w:numPr>
+          <w:ilvl w:val="0"/>
+          <w:numId w:val="2"/>
+        </w:numPr>
+        <w:spacing w:after="40" w:before="40"/>
+      </w:pPr>
+      <w:r>
+        <w:rPr>
+          <w:rFonts w:ascii="Calibri" w:cs="Calibri" w:eastAsia="Calibri" w:hAnsi="Calibri"/>
+          <w:sz w:val="22"/>
+          <w:szCs w:val="22"/>
+        </w:rPr>
+        <w:t xml:space="preserve">IMPORTANTE: el analisis original NO se modifica — la revision queda como nota auditable</w:t>
+      </w:r>
+    </w:p>
+    <w:p>
+      <w:pPr>
+        <w:spacing w:after="60"/>
+      </w:pPr>
+    </w:p>
+    <w:p>
+      <w:pPr>
+        <w:spacing w:after="40" w:before="40"/>
+      </w:pPr>
+      <w:r>
+        <w:rPr>
+          <w:rFonts w:ascii="Calibri" w:cs="Calibri" w:eastAsia="Calibri" w:hAnsi="Calibri"/>
+          <w:b/>
+          <w:bCs/>
+          <w:sz w:val="22"/>
+          <w:szCs w:val="22"/>
+        </w:rPr>
+        <w:t xml:space="preserve">Tab 4: Diagnosticos CIE-10</w:t>
+      </w:r>
+    </w:p>
+    <w:p>
+      <w:pPr>
+        <w:pStyle w:val="ListParagraph"/>
+        <w:numPr>
+          <w:ilvl w:val="0"/>
+          <w:numId w:val="2"/>
+        </w:numPr>
+        <w:spacing w:after="40" w:before="40"/>
+      </w:pPr>
+      <w:r>
+        <w:rPr>
+          <w:rFonts w:ascii="Calibri" w:cs="Calibri" w:eastAsia="Calibri" w:hAnsi="Calibri"/>
+          <w:sz w:val="22"/>
+          <w:szCs w:val="22"/>
+        </w:rPr>
+        <w:t xml:space="preserve">Hacer clic en "Agregar diagnosticos"</w:t>
+      </w:r>
+    </w:p>
+    <w:p>
+      <w:pPr>
+        <w:pStyle w:val="ListParagraph"/>
+        <w:numPr>
+          <w:ilvl w:val="0"/>
+          <w:numId w:val="2"/>
+        </w:numPr>
+        <w:spacing w:after="40" w:before="40"/>
+      </w:pPr>
+      <w:r>
+        <w:rPr>
+          <w:rFonts w:ascii="Calibri" w:cs="Calibri" w:eastAsia="Calibri" w:hAnsi="Calibri"/>
+          <w:sz w:val="22"/>
+          <w:szCs w:val="22"/>
+        </w:rPr>
+        <w:t xml:space="preserve">27 codigos CIE-10 precargados relevantes para longevidad (E11, E78, I10, K76, N18, R73, etc.)</w:t>
+      </w:r>
+    </w:p>
+    <w:p>
+      <w:pPr>
+        <w:pStyle w:val="ListParagraph"/>
+        <w:numPr>
+          <w:ilvl w:val="0"/>
+          <w:numId w:val="2"/>
+        </w:numPr>
+        <w:spacing w:after="40" w:before="40"/>
+      </w:pPr>
+      <w:r>
+        <w:rPr>
+          <w:rFonts w:ascii="Calibri" w:cs="Calibri" w:eastAsia="Calibri" w:hAnsi="Calibri"/>
+          <w:sz w:val="22"/>
+          <w:szCs w:val="22"/>
+        </w:rPr>
+        <w:t xml:space="preserve">Buscador por codigo o nombre</w:t>
+      </w:r>
+    </w:p>
+    <w:p>
+      <w:pPr>
+        <w:pStyle w:val="ListParagraph"/>
+        <w:numPr>
+          <w:ilvl w:val="0"/>
+          <w:numId w:val="2"/>
+        </w:numPr>
+        <w:spacing w:after="40" w:before="40"/>
+      </w:pPr>
+      <w:r>
+        <w:rPr>
+          <w:rFonts w:ascii="Calibri" w:cs="Calibri" w:eastAsia="Calibri" w:hAnsi="Calibri"/>
+          <w:sz w:val="22"/>
+          <w:szCs w:val="22"/>
+        </w:rPr>
+        <w:t xml:space="preserve">Seleccion multiple con badges</w:t>
+      </w:r>
+    </w:p>
+    <w:p>
+      <w:pPr>
+        <w:pStyle w:val="ListParagraph"/>
+        <w:numPr>
+          <w:ilvl w:val="0"/>
+          <w:numId w:val="2"/>
+        </w:numPr>
+        <w:spacing w:after="40" w:before="40"/>
+      </w:pPr>
+      <w:r>
+        <w:rPr>
+          <w:rFonts w:ascii="Calibri" w:cs="Calibri" w:eastAsia="Calibri" w:hAnsi="Calibri"/>
+          <w:sz w:val="22"/>
+          <w:szCs w:val="22"/>
+        </w:rPr>
+        <w:t xml:space="preserve">Los diagnosticos se guardan como nota con array de codigos</w:t>
       </w:r>
     </w:p>
     <w:p>
@@ -6182,6 +6716,388 @@
     </w:p>
     <w:p>
       <w:pPr>
+        <w:spacing w:after="60"/>
+      </w:pPr>
+    </w:p>
+    <w:p>
+      <w:pPr>
+        <w:spacing w:after="40" w:before="40"/>
+      </w:pPr>
+      <w:r>
+        <w:rPr>
+          <w:rFonts w:ascii="Calibri" w:cs="Calibri" w:eastAsia="Calibri" w:hAnsi="Calibri"/>
+          <w:sz w:val="22"/>
+          <w:szCs w:val="22"/>
+        </w:rPr>
+        <w:t xml:space="preserve">Panel lateral deslizable accesible desde el boton "Alertas" en la pantalla de pacientes. Badge rojo pulsante muestra conteo de alertas no leidas.</w:t>
+      </w:r>
+    </w:p>
+    <w:p>
+      <w:pPr>
+        <w:spacing w:after="60"/>
+      </w:pPr>
+    </w:p>
+    <w:p>
+      <w:pPr>
+        <w:spacing w:after="40" w:before="40"/>
+      </w:pPr>
+      <w:r>
+        <w:rPr>
+          <w:rFonts w:ascii="Calibri" w:cs="Calibri" w:eastAsia="Calibri" w:hAnsi="Calibri"/>
+          <w:b/>
+          <w:bCs/>
+          <w:sz w:val="22"/>
+          <w:szCs w:val="22"/>
+        </w:rPr>
+        <w:t xml:space="preserve">Generacion automatica de alertas (triggers):</w:t>
+      </w:r>
+    </w:p>
+    <w:p>
+      <w:pPr>
+        <w:spacing w:after="40" w:before="40"/>
+      </w:pPr>
+      <w:r>
+        <w:rPr>
+          <w:rFonts w:ascii="Calibri" w:cs="Calibri" w:eastAsia="Calibri" w:hAnsi="Calibri"/>
+          <w:sz w:val="22"/>
+          <w:szCs w:val="22"/>
+        </w:rPr>
+        <w:t xml:space="preserve">Las alertas se generan automaticamente al completar un analisis nuevo o re-analisis:</w:t>
+      </w:r>
+    </w:p>
+    <w:p>
+      <w:pPr>
+        <w:spacing w:after="60"/>
+      </w:pPr>
+    </w:p>
+    <w:tbl>
+      <w:tblPr>
+        <w:tblW w:type="dxa" w:w="9000"/>
+        <w:tblBorders>
+          <w:top w:val="single" w:color="auto" w:sz="4"/>
+          <w:left w:val="single" w:color="auto" w:sz="4"/>
+          <w:bottom w:val="single" w:color="auto" w:sz="4"/>
+          <w:right w:val="single" w:color="auto" w:sz="4"/>
+          <w:insideH w:val="single" w:color="auto" w:sz="4"/>
+          <w:insideV w:val="single" w:color="auto" w:sz="4"/>
+        </w:tblBorders>
+      </w:tblPr>
+      <w:tblGrid>
+        <w:gridCol w:w="100"/>
+        <w:gridCol w:w="100"/>
+        <w:gridCol w:w="100"/>
+      </w:tblGrid>
+      <w:tr>
+        <w:tc>
+          <w:tcPr>
+            <w:tcW w:type="dxa" w:w="3000"/>
+            <w:shd w:fill="050E1B" w:color="FFFFFF"/>
+          </w:tcPr>
+          <w:p>
+            <w:pPr>
+              <w:spacing w:after="40" w:before="40"/>
+            </w:pPr>
+            <w:r>
+              <w:rPr>
+                <w:rFonts w:ascii="Calibri" w:cs="Calibri" w:eastAsia="Calibri" w:hAnsi="Calibri"/>
+                <w:sz w:val="22"/>
+                <w:szCs w:val="22"/>
+              </w:rPr>
+              <w:t xml:space="preserve">Tipo de alerta</w:t>
+            </w:r>
+          </w:p>
+        </w:tc>
+        <w:tc>
+          <w:tcPr>
+            <w:tcW w:type="dxa" w:w="3000"/>
+            <w:shd w:fill="050E1B" w:color="FFFFFF"/>
+          </w:tcPr>
+          <w:p>
+            <w:pPr>
+              <w:spacing w:after="40" w:before="40"/>
+            </w:pPr>
+            <w:r>
+              <w:rPr>
+                <w:rFonts w:ascii="Calibri" w:cs="Calibri" w:eastAsia="Calibri" w:hAnsi="Calibri"/>
+                <w:sz w:val="22"/>
+                <w:szCs w:val="22"/>
+              </w:rPr>
+              <w:t xml:space="preserve">Nivel</w:t>
+            </w:r>
+          </w:p>
+        </w:tc>
+        <w:tc>
+          <w:tcPr>
+            <w:tcW w:type="dxa" w:w="3000"/>
+            <w:shd w:fill="050E1B" w:color="FFFFFF"/>
+          </w:tcPr>
+          <w:p>
+            <w:pPr>
+              <w:spacing w:after="40" w:before="40"/>
+            </w:pPr>
+            <w:r>
+              <w:rPr>
+                <w:rFonts w:ascii="Calibri" w:cs="Calibri" w:eastAsia="Calibri" w:hAnsi="Calibri"/>
+                <w:sz w:val="22"/>
+                <w:szCs w:val="22"/>
+              </w:rPr>
+              <w:t xml:space="preserve">Trigger</w:t>
+            </w:r>
+          </w:p>
+        </w:tc>
+      </w:tr>
+      <w:tr>
+        <w:tc>
+          <w:tcPr>
+            <w:tcW w:type="dxa" w:w="3000"/>
+          </w:tcPr>
+          <w:p>
+            <w:pPr>
+              <w:spacing w:after="40" w:before="40"/>
+            </w:pPr>
+            <w:r>
+              <w:rPr>
+                <w:rFonts w:ascii="Calibri" w:cs="Calibri" w:eastAsia="Calibri" w:hAnsi="Calibri"/>
+                <w:sz w:val="22"/>
+                <w:szCs w:val="22"/>
+              </w:rPr>
+              <w:t xml:space="preserve">Nuevo analisis</w:t>
+            </w:r>
+          </w:p>
+        </w:tc>
+        <w:tc>
+          <w:tcPr>
+            <w:tcW w:type="dxa" w:w="3000"/>
+          </w:tcPr>
+          <w:p>
+            <w:pPr>
+              <w:spacing w:after="40" w:before="40"/>
+            </w:pPr>
+            <w:r>
+              <w:rPr>
+                <w:rFonts w:ascii="Calibri" w:cs="Calibri" w:eastAsia="Calibri" w:hAnsi="Calibri"/>
+                <w:sz w:val="22"/>
+                <w:szCs w:val="22"/>
+              </w:rPr>
+              <w:t xml:space="preserve">info</w:t>
+            </w:r>
+          </w:p>
+        </w:tc>
+        <w:tc>
+          <w:tcPr>
+            <w:tcW w:type="dxa" w:w="3000"/>
+          </w:tcPr>
+          <w:p>
+            <w:pPr>
+              <w:spacing w:after="40" w:before="40"/>
+            </w:pPr>
+            <w:r>
+              <w:rPr>
+                <w:rFonts w:ascii="Calibri" w:cs="Calibri" w:eastAsia="Calibri" w:hAnsi="Calibri"/>
+                <w:sz w:val="22"/>
+                <w:szCs w:val="22"/>
+              </w:rPr>
+              <w:t xml:space="preserve">Paciente sube estudio de laboratorio</w:t>
+            </w:r>
+          </w:p>
+        </w:tc>
+      </w:tr>
+      <w:tr>
+        <w:tc>
+          <w:tcPr>
+            <w:tcW w:type="dxa" w:w="3000"/>
+          </w:tcPr>
+          <w:p>
+            <w:pPr>
+              <w:spacing w:after="40" w:before="40"/>
+            </w:pPr>
+            <w:r>
+              <w:rPr>
+                <w:rFonts w:ascii="Calibri" w:cs="Calibri" w:eastAsia="Calibri" w:hAnsi="Calibri"/>
+                <w:sz w:val="22"/>
+                <w:szCs w:val="22"/>
+              </w:rPr>
+              <w:t xml:space="preserve">Biomarcador critico</w:t>
+            </w:r>
+          </w:p>
+        </w:tc>
+        <w:tc>
+          <w:tcPr>
+            <w:tcW w:type="dxa" w:w="3000"/>
+          </w:tcPr>
+          <w:p>
+            <w:pPr>
+              <w:spacing w:after="40" w:before="40"/>
+            </w:pPr>
+            <w:r>
+              <w:rPr>
+                <w:rFonts w:ascii="Calibri" w:cs="Calibri" w:eastAsia="Calibri" w:hAnsi="Calibri"/>
+                <w:sz w:val="22"/>
+                <w:szCs w:val="22"/>
+              </w:rPr>
+              <w:t xml:space="preserve">danger/critical</w:t>
+            </w:r>
+          </w:p>
+        </w:tc>
+        <w:tc>
+          <w:tcPr>
+            <w:tcW w:type="dxa" w:w="3000"/>
+          </w:tcPr>
+          <w:p>
+            <w:pPr>
+              <w:spacing w:after="40" w:before="40"/>
+            </w:pPr>
+            <w:r>
+              <w:rPr>
+                <w:rFonts w:ascii="Calibri" w:cs="Calibri" w:eastAsia="Calibri" w:hAnsi="Calibri"/>
+                <w:sz w:val="22"/>
+                <w:szCs w:val="22"/>
+              </w:rPr>
+              <w:t xml:space="preserve">Biomarcador con status "danger" (critical si &gt;=3 biomarcadores)</w:t>
+            </w:r>
+          </w:p>
+        </w:tc>
+      </w:tr>
+      <w:tr>
+        <w:tc>
+          <w:tcPr>
+            <w:tcW w:type="dxa" w:w="3000"/>
+          </w:tcPr>
+          <w:p>
+            <w:pPr>
+              <w:spacing w:after="40" w:before="40"/>
+            </w:pPr>
+            <w:r>
+              <w:rPr>
+                <w:rFonts w:ascii="Calibri" w:cs="Calibri" w:eastAsia="Calibri" w:hAnsi="Calibri"/>
+                <w:sz w:val="22"/>
+                <w:szCs w:val="22"/>
+              </w:rPr>
+              <w:t xml:space="preserve">Biomarcador empeorado</w:t>
+            </w:r>
+          </w:p>
+        </w:tc>
+        <w:tc>
+          <w:tcPr>
+            <w:tcW w:type="dxa" w:w="3000"/>
+          </w:tcPr>
+          <w:p>
+            <w:pPr>
+              <w:spacing w:after="40" w:before="40"/>
+            </w:pPr>
+            <w:r>
+              <w:rPr>
+                <w:rFonts w:ascii="Calibri" w:cs="Calibri" w:eastAsia="Calibri" w:hAnsi="Calibri"/>
+                <w:sz w:val="22"/>
+                <w:szCs w:val="22"/>
+              </w:rPr>
+              <w:t xml:space="preserve">warning/danger</w:t>
+            </w:r>
+          </w:p>
+        </w:tc>
+        <w:tc>
+          <w:tcPr>
+            <w:tcW w:type="dxa" w:w="3000"/>
+          </w:tcPr>
+          <w:p>
+            <w:pPr>
+              <w:spacing w:after="40" w:before="40"/>
+            </w:pPr>
+            <w:r>
+              <w:rPr>
+                <w:rFonts w:ascii="Calibri" w:cs="Calibri" w:eastAsia="Calibri" w:hAnsi="Calibri"/>
+                <w:sz w:val="22"/>
+                <w:szCs w:val="22"/>
+              </w:rPr>
+              <w:t xml:space="preserve">Biomarcador empeora &gt;20% vs analisis anterior (danger si &gt;=3)</w:t>
+            </w:r>
+          </w:p>
+        </w:tc>
+      </w:tr>
+      <w:tr>
+        <w:tc>
+          <w:tcPr>
+            <w:tcW w:type="dxa" w:w="3000"/>
+          </w:tcPr>
+          <w:p>
+            <w:pPr>
+              <w:spacing w:after="40" w:before="40"/>
+            </w:pPr>
+            <w:r>
+              <w:rPr>
+                <w:rFonts w:ascii="Calibri" w:cs="Calibri" w:eastAsia="Calibri" w:hAnsi="Calibri"/>
+                <w:sz w:val="22"/>
+                <w:szCs w:val="22"/>
+              </w:rPr>
+              <w:t xml:space="preserve">Score critico</w:t>
+            </w:r>
+          </w:p>
+        </w:tc>
+        <w:tc>
+          <w:tcPr>
+            <w:tcW w:type="dxa" w:w="3000"/>
+          </w:tcPr>
+          <w:p>
+            <w:pPr>
+              <w:spacing w:after="40" w:before="40"/>
+            </w:pPr>
+            <w:r>
+              <w:rPr>
+                <w:rFonts w:ascii="Calibri" w:cs="Calibri" w:eastAsia="Calibri" w:hAnsi="Calibri"/>
+                <w:sz w:val="22"/>
+                <w:szCs w:val="22"/>
+              </w:rPr>
+              <w:t xml:space="preserve">critical</w:t>
+            </w:r>
+          </w:p>
+        </w:tc>
+        <w:tc>
+          <w:tcPr>
+            <w:tcW w:type="dxa" w:w="3000"/>
+          </w:tcPr>
+          <w:p>
+            <w:pPr>
+              <w:spacing w:after="40" w:before="40"/>
+            </w:pPr>
+            <w:r>
+              <w:rPr>
+                <w:rFonts w:ascii="Calibri" w:cs="Calibri" w:eastAsia="Calibri" w:hAnsi="Calibri"/>
+                <w:sz w:val="22"/>
+                <w:szCs w:val="22"/>
+              </w:rPr>
+              <w:t xml:space="preserve">Score General &lt;40/100</w:t>
+            </w:r>
+          </w:p>
+        </w:tc>
+      </w:tr>
+    </w:tbl>
+    <w:p>
+      <w:pPr>
+        <w:spacing w:after="120"/>
+      </w:pPr>
+    </w:p>
+    <w:p>
+      <w:pPr>
+        <w:spacing w:after="60"/>
+      </w:pPr>
+    </w:p>
+    <w:p>
+      <w:pPr>
+        <w:spacing w:after="40" w:before="40"/>
+      </w:pPr>
+      <w:r>
+        <w:rPr>
+          <w:rFonts w:ascii="Calibri" w:cs="Calibri" w:eastAsia="Calibri" w:hAnsi="Calibri"/>
+          <w:b/>
+          <w:bCs/>
+          <w:sz w:val="22"/>
+          <w:szCs w:val="22"/>
+        </w:rPr>
+        <w:t xml:space="preserve">Panel de alertas:</w:t>
+      </w:r>
+    </w:p>
+    <w:p>
+      <w:pPr>
         <w:pStyle w:val="ListParagraph"/>
         <w:numPr>
           <w:ilvl w:val="0"/>
@@ -6195,7 +7111,7 @@
           <w:sz w:val="22"/>
           <w:szCs w:val="22"/>
         </w:rPr>
-        <w:t xml:space="preserve">Notificacion cuando un paciente sube nuevo analisis</w:t>
+        <w:t xml:space="preserve">Resumen semanal: badges con "X requieren atencion", "Y en observacion", "Z estables"</w:t>
       </w:r>
     </w:p>
     <w:p>
@@ -6213,7 +7129,7 @@
           <w:sz w:val="22"/>
           <w:szCs w:val="22"/>
         </w:rPr>
-        <w:t xml:space="preserve">Alerta si algun biomarcador entra en rango DANGER</w:t>
+        <w:t xml:space="preserve">Priorizacion por paciente: pacientes ordenados por urgencia (critical &gt; danger &gt; warning &gt; info), cada uno es link directo a su dashboard</w:t>
       </w:r>
     </w:p>
     <w:p>
@@ -6231,7 +7147,7 @@
           <w:sz w:val="22"/>
           <w:szCs w:val="22"/>
         </w:rPr>
-        <w:t xml:space="preserve">Alerta si biomarcador empeora &gt;20% vs analisis anterior</w:t>
+        <w:t xml:space="preserve">Filtros: Todas / Sin leer / Criticas</w:t>
       </w:r>
     </w:p>
     <w:p>
@@ -6249,7 +7165,7 @@
           <w:sz w:val="22"/>
           <w:szCs w:val="22"/>
         </w:rPr>
-        <w:t xml:space="preserve">Marcado como leida/descartada</w:t>
+        <w:t xml:space="preserve">Acciones masivas: Marcar todo como leido, Descartar todo</w:t>
       </w:r>
     </w:p>
     <w:p>
@@ -6267,7 +7183,53 @@
           <w:sz w:val="22"/>
           <w:szCs w:val="22"/>
         </w:rPr>
-        <w:t xml:space="preserve">API: GET /api/medico/alerts, PATCH para marcar como leidas</w:t>
+        <w:t xml:space="preserve">Cada alerta muestra: icono por tipo, nivel de severidad, titulo, detalle, nombre del paciente, fecha</w:t>
+      </w:r>
+    </w:p>
+    <w:p>
+      <w:pPr>
+        <w:pStyle w:val="ListParagraph"/>
+        <w:numPr>
+          <w:ilvl w:val="0"/>
+          <w:numId w:val="1"/>
+        </w:numPr>
+        <w:spacing w:after="40" w:before="40"/>
+      </w:pPr>
+      <w:r>
+        <w:rPr>
+          <w:rFonts w:ascii="Calibri" w:cs="Calibri" w:eastAsia="Calibri" w:hAnsi="Calibri"/>
+          <w:sz w:val="22"/>
+          <w:szCs w:val="22"/>
+        </w:rPr>
+        <w:t xml:space="preserve">Acciones por alerta: Marcar como leida / Descartar / Ver dashboard del paciente</w:t>
+      </w:r>
+    </w:p>
+    <w:p>
+      <w:pPr>
+        <w:spacing w:after="60"/>
+      </w:pPr>
+    </w:p>
+    <w:p>
+      <w:pPr>
+        <w:spacing w:after="40" w:before="40"/>
+      </w:pPr>
+      <w:r>
+        <w:rPr>
+          <w:rFonts w:ascii="Calibri" w:cs="Calibri" w:eastAsia="Calibri" w:hAnsi="Calibri"/>
+          <w:b/>
+          <w:bCs/>
+          <w:sz w:val="22"/>
+          <w:szCs w:val="22"/>
+        </w:rPr>
+        <w:t xml:space="preserve">Impacto:</w:t>
+      </w:r>
+      <w:r>
+        <w:rPr>
+          <w:rFonts w:ascii="Calibri" w:cs="Calibri" w:eastAsia="Calibri" w:hAnsi="Calibri"/>
+          <w:sz w:val="22"/>
+          <w:szCs w:val="22"/>
+        </w:rPr>
+        <w:t xml:space="preserve"> El medico no revisa 50 dashboards uno por uno — ve primero los pacientes que necesitan atencion inmediata.</w:t>
       </w:r>
     </w:p>
     <w:p>
@@ -6289,7 +7251,686 @@
           <w:sz w:val="24"/>
           <w:szCs w:val="24"/>
         </w:rPr>
-        <w:t xml:space="preserve">4.2.10 Desvincular Paciente</w:t>
+        <w:t xml:space="preserve">4.2.11 Prescripcion Digital</w:t>
+      </w:r>
+    </w:p>
+    <w:p>
+      <w:pPr>
+        <w:spacing w:after="60"/>
+      </w:pPr>
+    </w:p>
+    <w:p>
+      <w:pPr>
+        <w:spacing w:after="40" w:before="40"/>
+      </w:pPr>
+      <w:r>
+        <w:rPr>
+          <w:rFonts w:ascii="Calibri" w:cs="Calibri" w:eastAsia="Calibri" w:hAnsi="Calibri"/>
+          <w:sz w:val="22"/>
+          <w:szCs w:val="22"/>
+        </w:rPr>
+        <w:t xml:space="preserve">Boton "Generar Prescripcion" en el tab Protocolo del dashboard (solo medicos). Abre un modal fullscreen para convertir el protocolo de IA en una receta medica legal.</w:t>
+      </w:r>
+    </w:p>
+    <w:p>
+      <w:pPr>
+        <w:spacing w:after="60"/>
+      </w:pPr>
+    </w:p>
+    <w:p>
+      <w:pPr>
+        <w:spacing w:after="40" w:before="40"/>
+      </w:pPr>
+      <w:r>
+        <w:rPr>
+          <w:rFonts w:ascii="Calibri" w:cs="Calibri" w:eastAsia="Calibri" w:hAnsi="Calibri"/>
+          <w:b/>
+          <w:bCs/>
+          <w:sz w:val="22"/>
+          <w:szCs w:val="22"/>
+        </w:rPr>
+        <w:t xml:space="preserve">Funcionalidad:</w:t>
+      </w:r>
+    </w:p>
+    <w:p>
+      <w:pPr>
+        <w:pStyle w:val="ListParagraph"/>
+        <w:numPr>
+          <w:ilvl w:val="0"/>
+          <w:numId w:val="2"/>
+        </w:numPr>
+        <w:spacing w:after="40" w:before="40"/>
+      </w:pPr>
+      <w:r>
+        <w:rPr>
+          <w:rFonts w:ascii="Calibri" w:cs="Calibri" w:eastAsia="Calibri" w:hAnsi="Calibri"/>
+          <w:sz w:val="22"/>
+          <w:szCs w:val="22"/>
+        </w:rPr>
+        <w:t xml:space="preserve">Cada intervencion del protocolo IA se puede: Aprobar / Rechazar / Modificar dosis</w:t>
+      </w:r>
+    </w:p>
+    <w:p>
+      <w:pPr>
+        <w:pStyle w:val="ListParagraph"/>
+        <w:numPr>
+          <w:ilvl w:val="0"/>
+          <w:numId w:val="2"/>
+        </w:numPr>
+        <w:spacing w:after="40" w:before="40"/>
+      </w:pPr>
+      <w:r>
+        <w:rPr>
+          <w:rFonts w:ascii="Calibri" w:cs="Calibri" w:eastAsia="Calibri" w:hAnsi="Calibri"/>
+          <w:sz w:val="22"/>
+          <w:szCs w:val="22"/>
+        </w:rPr>
+        <w:t xml:space="preserve">Clasificacion por tipo: </w:t>
+      </w:r>
+      <w:r>
+        <w:rPr>
+          <w:rFonts w:ascii="Calibri" w:cs="Calibri" w:eastAsia="Calibri" w:hAnsi="Calibri"/>
+          <w:b/>
+          <w:bCs/>
+          <w:sz w:val="22"/>
+          <w:szCs w:val="22"/>
+        </w:rPr>
+        <w:t xml:space="preserve">OTC</w:t>
+      </w:r>
+      <w:r>
+        <w:rPr>
+          <w:rFonts w:ascii="Calibri" w:cs="Calibri" w:eastAsia="Calibri" w:hAnsi="Calibri"/>
+          <w:sz w:val="22"/>
+          <w:szCs w:val="22"/>
+        </w:rPr>
+        <w:t xml:space="preserve"> (paciente compra solo) / </w:t>
+      </w:r>
+      <w:r>
+        <w:rPr>
+          <w:rFonts w:ascii="Calibri" w:cs="Calibri" w:eastAsia="Calibri" w:hAnsi="Calibri"/>
+          <w:b/>
+          <w:bCs/>
+          <w:sz w:val="22"/>
+          <w:szCs w:val="22"/>
+        </w:rPr>
+        <w:t xml:space="preserve">Rx</w:t>
+      </w:r>
+      <w:r>
+        <w:rPr>
+          <w:rFonts w:ascii="Calibri" w:cs="Calibri" w:eastAsia="Calibri" w:hAnsi="Calibri"/>
+          <w:sz w:val="22"/>
+          <w:szCs w:val="22"/>
+        </w:rPr>
+        <w:t xml:space="preserve"> (requiere receta medica) / </w:t>
+      </w:r>
+      <w:r>
+        <w:rPr>
+          <w:rFonts w:ascii="Calibri" w:cs="Calibri" w:eastAsia="Calibri" w:hAnsi="Calibri"/>
+          <w:b/>
+          <w:bCs/>
+          <w:sz w:val="22"/>
+          <w:szCs w:val="22"/>
+        </w:rPr>
+        <w:t xml:space="preserve">Procedimiento</w:t>
+      </w:r>
+      <w:r>
+        <w:rPr>
+          <w:rFonts w:ascii="Calibri" w:cs="Calibri" w:eastAsia="Calibri" w:hAnsi="Calibri"/>
+          <w:sz w:val="22"/>
+          <w:szCs w:val="22"/>
+        </w:rPr>
+        <w:t xml:space="preserve"> (clinica)</w:t>
+      </w:r>
+    </w:p>
+    <w:p>
+      <w:pPr>
+        <w:pStyle w:val="ListParagraph"/>
+        <w:numPr>
+          <w:ilvl w:val="0"/>
+          <w:numId w:val="2"/>
+        </w:numPr>
+        <w:spacing w:after="40" w:before="40"/>
+      </w:pPr>
+      <w:r>
+        <w:rPr>
+          <w:rFonts w:ascii="Calibri" w:cs="Calibri" w:eastAsia="Calibri" w:hAnsi="Calibri"/>
+          <w:sz w:val="22"/>
+          <w:szCs w:val="22"/>
+        </w:rPr>
+        <w:t xml:space="preserve">Toggle "Requiere supervision medica" por intervencion (auto-activado para Rx y procedimientos)</w:t>
+      </w:r>
+    </w:p>
+    <w:p>
+      <w:pPr>
+        <w:pStyle w:val="ListParagraph"/>
+        <w:numPr>
+          <w:ilvl w:val="0"/>
+          <w:numId w:val="2"/>
+        </w:numPr>
+        <w:spacing w:after="40" w:before="40"/>
+      </w:pPr>
+      <w:r>
+        <w:rPr>
+          <w:rFonts w:ascii="Calibri" w:cs="Calibri" w:eastAsia="Calibri" w:hAnsi="Calibri"/>
+          <w:sz w:val="22"/>
+          <w:szCs w:val="22"/>
+        </w:rPr>
+        <w:t xml:space="preserve">Agregar intervenciones propias del medico (no solo las de IA): molecula, dosis, clasificacion, instrucciones</w:t>
+      </w:r>
+    </w:p>
+    <w:p>
+      <w:pPr>
+        <w:pStyle w:val="ListParagraph"/>
+        <w:numPr>
+          <w:ilvl w:val="0"/>
+          <w:numId w:val="2"/>
+        </w:numPr>
+        <w:spacing w:after="40" w:before="40"/>
+      </w:pPr>
+      <w:r>
+        <w:rPr>
+          <w:rFonts w:ascii="Calibri" w:cs="Calibri" w:eastAsia="Calibri" w:hAnsi="Calibri"/>
+          <w:sz w:val="22"/>
+          <w:szCs w:val="22"/>
+        </w:rPr>
+        <w:t xml:space="preserve">Campo de notas y observaciones generales</w:t>
+      </w:r>
+    </w:p>
+    <w:p>
+      <w:pPr>
+        <w:pStyle w:val="ListParagraph"/>
+        <w:numPr>
+          <w:ilvl w:val="0"/>
+          <w:numId w:val="2"/>
+        </w:numPr>
+        <w:spacing w:after="40" w:before="40"/>
+      </w:pPr>
+      <w:r>
+        <w:rPr>
+          <w:rFonts w:ascii="Calibri" w:cs="Calibri" w:eastAsia="Calibri" w:hAnsi="Calibri"/>
+          <w:sz w:val="22"/>
+          <w:szCs w:val="22"/>
+        </w:rPr>
+        <w:t xml:space="preserve">Boton "Aprobar todas" para accion masiva</w:t>
+      </w:r>
+    </w:p>
+    <w:p>
+      <w:pPr>
+        <w:spacing w:after="60"/>
+      </w:pPr>
+    </w:p>
+    <w:p>
+      <w:pPr>
+        <w:spacing w:after="40" w:before="40"/>
+      </w:pPr>
+      <w:r>
+        <w:rPr>
+          <w:rFonts w:ascii="Calibri" w:cs="Calibri" w:eastAsia="Calibri" w:hAnsi="Calibri"/>
+          <w:b/>
+          <w:bCs/>
+          <w:sz w:val="22"/>
+          <w:szCs w:val="22"/>
+        </w:rPr>
+        <w:t xml:space="preserve">PDF generado (jsPDF, formato A4):</w:t>
+      </w:r>
+    </w:p>
+    <w:p>
+      <w:pPr>
+        <w:spacing w:after="60"/>
+      </w:pPr>
+    </w:p>
+    <w:tbl>
+      <w:tblPr>
+        <w:tblW w:type="dxa" w:w="9000"/>
+        <w:tblBorders>
+          <w:top w:val="single" w:color="auto" w:sz="4"/>
+          <w:left w:val="single" w:color="auto" w:sz="4"/>
+          <w:bottom w:val="single" w:color="auto" w:sz="4"/>
+          <w:right w:val="single" w:color="auto" w:sz="4"/>
+          <w:insideH w:val="single" w:color="auto" w:sz="4"/>
+          <w:insideV w:val="single" w:color="auto" w:sz="4"/>
+        </w:tblBorders>
+      </w:tblPr>
+      <w:tblGrid>
+        <w:gridCol w:w="100"/>
+        <w:gridCol w:w="100"/>
+      </w:tblGrid>
+      <w:tr>
+        <w:tc>
+          <w:tcPr>
+            <w:tcW w:type="dxa" w:w="4500"/>
+            <w:shd w:fill="050E1B" w:color="FFFFFF"/>
+          </w:tcPr>
+          <w:p>
+            <w:pPr>
+              <w:spacing w:after="40" w:before="40"/>
+            </w:pPr>
+            <w:r>
+              <w:rPr>
+                <w:rFonts w:ascii="Calibri" w:cs="Calibri" w:eastAsia="Calibri" w:hAnsi="Calibri"/>
+                <w:sz w:val="22"/>
+                <w:szCs w:val="22"/>
+              </w:rPr>
+              <w:t xml:space="preserve">Seccion</w:t>
+            </w:r>
+          </w:p>
+        </w:tc>
+        <w:tc>
+          <w:tcPr>
+            <w:tcW w:type="dxa" w:w="4500"/>
+            <w:shd w:fill="050E1B" w:color="FFFFFF"/>
+          </w:tcPr>
+          <w:p>
+            <w:pPr>
+              <w:spacing w:after="40" w:before="40"/>
+            </w:pPr>
+            <w:r>
+              <w:rPr>
+                <w:rFonts w:ascii="Calibri" w:cs="Calibri" w:eastAsia="Calibri" w:hAnsi="Calibri"/>
+                <w:sz w:val="22"/>
+                <w:szCs w:val="22"/>
+              </w:rPr>
+              <w:t xml:space="preserve">Contenido</w:t>
+            </w:r>
+          </w:p>
+        </w:tc>
+      </w:tr>
+      <w:tr>
+        <w:tc>
+          <w:tcPr>
+            <w:tcW w:type="dxa" w:w="4500"/>
+          </w:tcPr>
+          <w:p>
+            <w:pPr>
+              <w:spacing w:after="40" w:before="40"/>
+            </w:pPr>
+            <w:r>
+              <w:rPr>
+                <w:rFonts w:ascii="Calibri" w:cs="Calibri" w:eastAsia="Calibri" w:hAnsi="Calibri"/>
+                <w:sz w:val="22"/>
+                <w:szCs w:val="22"/>
+              </w:rPr>
+              <w:t xml:space="preserve">Membrete</w:t>
+            </w:r>
+          </w:p>
+        </w:tc>
+        <w:tc>
+          <w:tcPr>
+            <w:tcW w:type="dxa" w:w="4500"/>
+          </w:tcPr>
+          <w:p>
+            <w:pPr>
+              <w:spacing w:after="40" w:before="40"/>
+            </w:pPr>
+            <w:r>
+              <w:rPr>
+                <w:rFonts w:ascii="Calibri" w:cs="Calibri" w:eastAsia="Calibri" w:hAnsi="Calibri"/>
+                <w:sz w:val="22"/>
+                <w:szCs w:val="22"/>
+              </w:rPr>
+              <w:t xml:space="preserve">Nombre del medico, especialidad, cedula profesional, email</w:t>
+            </w:r>
+          </w:p>
+        </w:tc>
+      </w:tr>
+      <w:tr>
+        <w:tc>
+          <w:tcPr>
+            <w:tcW w:type="dxa" w:w="4500"/>
+          </w:tcPr>
+          <w:p>
+            <w:pPr>
+              <w:spacing w:after="40" w:before="40"/>
+            </w:pPr>
+            <w:r>
+              <w:rPr>
+                <w:rFonts w:ascii="Calibri" w:cs="Calibri" w:eastAsia="Calibri" w:hAnsi="Calibri"/>
+                <w:sz w:val="22"/>
+                <w:szCs w:val="22"/>
+              </w:rPr>
+              <w:t xml:space="preserve">Titulo</w:t>
+            </w:r>
+          </w:p>
+        </w:tc>
+        <w:tc>
+          <w:tcPr>
+            <w:tcW w:type="dxa" w:w="4500"/>
+          </w:tcPr>
+          <w:p>
+            <w:pPr>
+              <w:spacing w:after="40" w:before="40"/>
+            </w:pPr>
+            <w:r>
+              <w:rPr>
+                <w:rFonts w:ascii="Calibri" w:cs="Calibri" w:eastAsia="Calibri" w:hAnsi="Calibri"/>
+                <w:sz w:val="22"/>
+                <w:szCs w:val="22"/>
+              </w:rPr>
+              <w:t xml:space="preserve">"PRESCRIPCION MEDICA" con fecha</w:t>
+            </w:r>
+          </w:p>
+        </w:tc>
+      </w:tr>
+      <w:tr>
+        <w:tc>
+          <w:tcPr>
+            <w:tcW w:type="dxa" w:w="4500"/>
+          </w:tcPr>
+          <w:p>
+            <w:pPr>
+              <w:spacing w:after="40" w:before="40"/>
+            </w:pPr>
+            <w:r>
+              <w:rPr>
+                <w:rFonts w:ascii="Calibri" w:cs="Calibri" w:eastAsia="Calibri" w:hAnsi="Calibri"/>
+                <w:sz w:val="22"/>
+                <w:szCs w:val="22"/>
+              </w:rPr>
+              <w:t xml:space="preserve">Datos del paciente</w:t>
+            </w:r>
+          </w:p>
+        </w:tc>
+        <w:tc>
+          <w:tcPr>
+            <w:tcW w:type="dxa" w:w="4500"/>
+          </w:tcPr>
+          <w:p>
+            <w:pPr>
+              <w:spacing w:after="40" w:before="40"/>
+            </w:pPr>
+            <w:r>
+              <w:rPr>
+                <w:rFonts w:ascii="Calibri" w:cs="Calibri" w:eastAsia="Calibri" w:hAnsi="Calibri"/>
+                <w:sz w:val="22"/>
+                <w:szCs w:val="22"/>
+              </w:rPr>
+              <w:t xml:space="preserve">Nombre, edad, genero, peso, estatura</w:t>
+            </w:r>
+          </w:p>
+        </w:tc>
+      </w:tr>
+      <w:tr>
+        <w:tc>
+          <w:tcPr>
+            <w:tcW w:type="dxa" w:w="4500"/>
+          </w:tcPr>
+          <w:p>
+            <w:pPr>
+              <w:spacing w:after="40" w:before="40"/>
+            </w:pPr>
+            <w:r>
+              <w:rPr>
+                <w:rFonts w:ascii="Calibri" w:cs="Calibri" w:eastAsia="Calibri" w:hAnsi="Calibri"/>
+                <w:sz w:val="22"/>
+                <w:szCs w:val="22"/>
+              </w:rPr>
+              <w:t xml:space="preserve">Medicamentos Rx</w:t>
+            </w:r>
+          </w:p>
+        </w:tc>
+        <w:tc>
+          <w:tcPr>
+            <w:tcW w:type="dxa" w:w="4500"/>
+          </w:tcPr>
+          <w:p>
+            <w:pPr>
+              <w:spacing w:after="40" w:before="40"/>
+            </w:pPr>
+            <w:r>
+              <w:rPr>
+                <w:rFonts w:ascii="Calibri" w:cs="Calibri" w:eastAsia="Calibri" w:hAnsi="Calibri"/>
+                <w:sz w:val="22"/>
+                <w:szCs w:val="22"/>
+              </w:rPr>
+              <w:t xml:space="preserve">Intervenciones con receta, badge "SUPERVISION MEDICA" si aplica</w:t>
+            </w:r>
+          </w:p>
+        </w:tc>
+      </w:tr>
+      <w:tr>
+        <w:tc>
+          <w:tcPr>
+            <w:tcW w:type="dxa" w:w="4500"/>
+          </w:tcPr>
+          <w:p>
+            <w:pPr>
+              <w:spacing w:after="40" w:before="40"/>
+            </w:pPr>
+            <w:r>
+              <w:rPr>
+                <w:rFonts w:ascii="Calibri" w:cs="Calibri" w:eastAsia="Calibri" w:hAnsi="Calibri"/>
+                <w:sz w:val="22"/>
+                <w:szCs w:val="22"/>
+              </w:rPr>
+              <w:t xml:space="preserve">Suplementos OTC</w:t>
+            </w:r>
+          </w:p>
+        </w:tc>
+        <w:tc>
+          <w:tcPr>
+            <w:tcW w:type="dxa" w:w="4500"/>
+          </w:tcPr>
+          <w:p>
+            <w:pPr>
+              <w:spacing w:after="40" w:before="40"/>
+            </w:pPr>
+            <w:r>
+              <w:rPr>
+                <w:rFonts w:ascii="Calibri" w:cs="Calibri" w:eastAsia="Calibri" w:hAnsi="Calibri"/>
+                <w:sz w:val="22"/>
+                <w:szCs w:val="22"/>
+              </w:rPr>
+              <w:t xml:space="preserve">Intervenciones de venta libre</w:t>
+            </w:r>
+          </w:p>
+        </w:tc>
+      </w:tr>
+      <w:tr>
+        <w:tc>
+          <w:tcPr>
+            <w:tcW w:type="dxa" w:w="4500"/>
+          </w:tcPr>
+          <w:p>
+            <w:pPr>
+              <w:spacing w:after="40" w:before="40"/>
+            </w:pPr>
+            <w:r>
+              <w:rPr>
+                <w:rFonts w:ascii="Calibri" w:cs="Calibri" w:eastAsia="Calibri" w:hAnsi="Calibri"/>
+                <w:sz w:val="22"/>
+                <w:szCs w:val="22"/>
+              </w:rPr>
+              <w:t xml:space="preserve">Procedimientos</w:t>
+            </w:r>
+          </w:p>
+        </w:tc>
+        <w:tc>
+          <w:tcPr>
+            <w:tcW w:type="dxa" w:w="4500"/>
+          </w:tcPr>
+          <w:p>
+            <w:pPr>
+              <w:spacing w:after="40" w:before="40"/>
+            </w:pPr>
+            <w:r>
+              <w:rPr>
+                <w:rFonts w:ascii="Calibri" w:cs="Calibri" w:eastAsia="Calibri" w:hAnsi="Calibri"/>
+                <w:sz w:val="22"/>
+                <w:szCs w:val="22"/>
+              </w:rPr>
+              <w:t xml:space="preserve">Intervenciones clinicas (hUC-MSC, exosomas, etc.)</w:t>
+            </w:r>
+          </w:p>
+        </w:tc>
+      </w:tr>
+      <w:tr>
+        <w:tc>
+          <w:tcPr>
+            <w:tcW w:type="dxa" w:w="4500"/>
+          </w:tcPr>
+          <w:p>
+            <w:pPr>
+              <w:spacing w:after="40" w:before="40"/>
+            </w:pPr>
+            <w:r>
+              <w:rPr>
+                <w:rFonts w:ascii="Calibri" w:cs="Calibri" w:eastAsia="Calibri" w:hAnsi="Calibri"/>
+                <w:sz w:val="22"/>
+                <w:szCs w:val="22"/>
+              </w:rPr>
+              <w:t xml:space="preserve">Notas</w:t>
+            </w:r>
+          </w:p>
+        </w:tc>
+        <w:tc>
+          <w:tcPr>
+            <w:tcW w:type="dxa" w:w="4500"/>
+          </w:tcPr>
+          <w:p>
+            <w:pPr>
+              <w:spacing w:after="40" w:before="40"/>
+            </w:pPr>
+            <w:r>
+              <w:rPr>
+                <w:rFonts w:ascii="Calibri" w:cs="Calibri" w:eastAsia="Calibri" w:hAnsi="Calibri"/>
+                <w:sz w:val="22"/>
+                <w:szCs w:val="22"/>
+              </w:rPr>
+              <w:t xml:space="preserve">Observaciones del medico</w:t>
+            </w:r>
+          </w:p>
+        </w:tc>
+      </w:tr>
+      <w:tr>
+        <w:tc>
+          <w:tcPr>
+            <w:tcW w:type="dxa" w:w="4500"/>
+          </w:tcPr>
+          <w:p>
+            <w:pPr>
+              <w:spacing w:after="40" w:before="40"/>
+            </w:pPr>
+            <w:r>
+              <w:rPr>
+                <w:rFonts w:ascii="Calibri" w:cs="Calibri" w:eastAsia="Calibri" w:hAnsi="Calibri"/>
+                <w:sz w:val="22"/>
+                <w:szCs w:val="22"/>
+              </w:rPr>
+              <w:t xml:space="preserve">Firma</w:t>
+            </w:r>
+          </w:p>
+        </w:tc>
+        <w:tc>
+          <w:tcPr>
+            <w:tcW w:type="dxa" w:w="4500"/>
+          </w:tcPr>
+          <w:p>
+            <w:pPr>
+              <w:spacing w:after="40" w:before="40"/>
+            </w:pPr>
+            <w:r>
+              <w:rPr>
+                <w:rFonts w:ascii="Calibri" w:cs="Calibri" w:eastAsia="Calibri" w:hAnsi="Calibri"/>
+                <w:sz w:val="22"/>
+                <w:szCs w:val="22"/>
+              </w:rPr>
+              <w:t xml:space="preserve">Linea de firma + nombre + especialidad + cedula profesional</w:t>
+            </w:r>
+          </w:p>
+        </w:tc>
+      </w:tr>
+      <w:tr>
+        <w:tc>
+          <w:tcPr>
+            <w:tcW w:type="dxa" w:w="4500"/>
+          </w:tcPr>
+          <w:p>
+            <w:pPr>
+              <w:spacing w:after="40" w:before="40"/>
+            </w:pPr>
+            <w:r>
+              <w:rPr>
+                <w:rFonts w:ascii="Calibri" w:cs="Calibri" w:eastAsia="Calibri" w:hAnsi="Calibri"/>
+                <w:sz w:val="22"/>
+                <w:szCs w:val="22"/>
+              </w:rPr>
+              <w:t xml:space="preserve">Pie de pagina</w:t>
+            </w:r>
+          </w:p>
+        </w:tc>
+        <w:tc>
+          <w:tcPr>
+            <w:tcW w:type="dxa" w:w="4500"/>
+          </w:tcPr>
+          <w:p>
+            <w:pPr>
+              <w:spacing w:after="40" w:before="40"/>
+            </w:pPr>
+            <w:r>
+              <w:rPr>
+                <w:rFonts w:ascii="Calibri" w:cs="Calibri" w:eastAsia="Calibri" w:hAnsi="Calibri"/>
+                <w:sz w:val="22"/>
+                <w:szCs w:val="22"/>
+              </w:rPr>
+              <w:t xml:space="preserve">"Prescripcion generada por Longevity IA — Longevity Clinic SA de CV"</w:t>
+            </w:r>
+          </w:p>
+        </w:tc>
+      </w:tr>
+    </w:tbl>
+    <w:p>
+      <w:pPr>
+        <w:spacing w:after="120"/>
+      </w:pPr>
+    </w:p>
+    <w:p>
+      <w:pPr>
+        <w:spacing w:after="60"/>
+      </w:pPr>
+    </w:p>
+    <w:p>
+      <w:pPr>
+        <w:spacing w:after="40" w:before="40"/>
+      </w:pPr>
+      <w:r>
+        <w:rPr>
+          <w:rFonts w:ascii="Calibri" w:cs="Calibri" w:eastAsia="Calibri" w:hAnsi="Calibri"/>
+          <w:b/>
+          <w:bCs/>
+          <w:sz w:val="22"/>
+          <w:szCs w:val="22"/>
+        </w:rPr>
+        <w:t xml:space="preserve">Separacion de responsabilidad:</w:t>
+      </w:r>
+      <w:r>
+        <w:rPr>
+          <w:rFonts w:ascii="Calibri" w:cs="Calibri" w:eastAsia="Calibri" w:hAnsi="Calibri"/>
+          <w:sz w:val="22"/>
+          <w:szCs w:val="22"/>
+        </w:rPr>
+        <w:t xml:space="preserve"> El analisis de IA (lab_results.ai_analysis) es INMUTABLE. La prescripcion es una capa adicional del medico que no modifica el analisis original. El PDF es el documento legal con la firma del medico.</w:t>
+      </w:r>
+    </w:p>
+    <w:p>
+      <w:pPr>
+        <w:spacing w:after="60"/>
+      </w:pPr>
+    </w:p>
+    <w:p>
+      <w:pPr>
+        <w:pStyle w:val="Heading3"/>
+        <w:spacing w:after="60" w:before="160"/>
+      </w:pPr>
+      <w:r>
+        <w:rPr>
+          <w:rFonts w:ascii="Calibri" w:cs="Calibri" w:eastAsia="Calibri" w:hAnsi="Calibri"/>
+          <w:b/>
+          <w:bCs/>
+          <w:color w:val="C9A84C"/>
+          <w:sz w:val="24"/>
+          <w:szCs w:val="24"/>
+        </w:rPr>
+        <w:t xml:space="preserve">4.2.12 Desvincular Paciente</w:t>
       </w:r>
     </w:p>
     <w:p>
@@ -8483,7 +10124,7 @@
           <w:sz w:val="18"/>
           <w:szCs w:val="18"/>
         </w:rPr>
-        <w:t xml:space="preserve">│   │   ├── InvitationsPanel.tsx  # Panel de invitaciones</w:t>
+        <w:t xml:space="preserve">│   │   ├── InvitationsPanel.tsx    # Panel de invitaciones</w:t>
       </w:r>
     </w:p>
     <w:p>
@@ -8498,7 +10139,7 @@
           <w:sz w:val="18"/>
           <w:szCs w:val="18"/>
         </w:rPr>
-        <w:t xml:space="preserve">│   │   └── ClinicalNotesPanel.tsx # Notas clinicas SOAP</w:t>
+        <w:t xml:space="preserve">│   │   ├── AlertsPanel.tsx         # Panel lateral de alertas inteligentes</w:t>
       </w:r>
     </w:p>
     <w:p>
@@ -8513,7 +10154,7 @@
           <w:sz w:val="18"/>
           <w:szCs w:val="18"/>
         </w:rPr>
-        <w:t xml:space="preserve">│   ├── patients/</w:t>
+        <w:t xml:space="preserve">│   │   ├── ClinicalNotesPanel.tsx  # Panel clinico (SOAP + biomarcadores + protocolo + CIE-10)</w:t>
       </w:r>
     </w:p>
     <w:p>
@@ -8528,7 +10169,7 @@
           <w:sz w:val="18"/>
           <w:szCs w:val="18"/>
         </w:rPr>
-        <w:t xml:space="preserve">│   │   ├── PatientCard.tsx       # Tarjeta de paciente (multi-rol)</w:t>
+        <w:t xml:space="preserve">│   │   └── PrescriptionBuilder.tsx # Constructor de prescripcion digital</w:t>
       </w:r>
     </w:p>
     <w:p>
@@ -8543,7 +10184,7 @@
           <w:sz w:val="18"/>
           <w:szCs w:val="18"/>
         </w:rPr>
-        <w:t xml:space="preserve">│   │   ├── AnalysisCards.tsx     # Tarjetas de analisis por fecha</w:t>
+        <w:t xml:space="preserve">│   ├── patients/</w:t>
       </w:r>
     </w:p>
     <w:p>
@@ -8558,7 +10199,7 @@
           <w:sz w:val="18"/>
           <w:szCs w:val="18"/>
         </w:rPr>
-        <w:t xml:space="preserve">│   │   ├── MedicoLinksPanel.tsx  # Vinculacion con medicos</w:t>
+        <w:t xml:space="preserve">│   │   ├── PatientCard.tsx       # Tarjeta de paciente (multi-rol)</w:t>
       </w:r>
     </w:p>
     <w:p>
@@ -8573,7 +10214,7 @@
           <w:sz w:val="18"/>
           <w:szCs w:val="18"/>
         </w:rPr>
-        <w:t xml:space="preserve">│   │   └── NewPatientModal.tsx   # Crear paciente</w:t>
+        <w:t xml:space="preserve">│   │   ├── AnalysisCards.tsx     # Tarjetas de analisis por fecha</w:t>
       </w:r>
     </w:p>
     <w:p>
@@ -8588,7 +10229,7 @@
           <w:sz w:val="18"/>
           <w:szCs w:val="18"/>
         </w:rPr>
-        <w:t xml:space="preserve">│   ├── ui/                       # Componentes UI reutilizables</w:t>
+        <w:t xml:space="preserve">│   │   ├── MedicoLinksPanel.tsx  # Vinculacion con medicos</w:t>
       </w:r>
     </w:p>
     <w:p>
@@ -8603,7 +10244,7 @@
           <w:sz w:val="18"/>
           <w:szCs w:val="18"/>
         </w:rPr>
-        <w:t xml:space="preserve">│   └── upload/FileUploader.tsx   # Componente de carga de archivos</w:t>
+        <w:t xml:space="preserve">│   │   └── NewPatientModal.tsx   # Crear paciente</w:t>
       </w:r>
     </w:p>
     <w:p>
@@ -8618,7 +10259,7 @@
           <w:sz w:val="18"/>
           <w:szCs w:val="18"/>
         </w:rPr>
-        <w:t xml:space="preserve">│</w:t>
+        <w:t xml:space="preserve">│   ├── ui/                       # Componentes UI reutilizables</w:t>
       </w:r>
     </w:p>
     <w:p>
@@ -8633,7 +10274,7 @@
           <w:sz w:val="18"/>
           <w:szCs w:val="18"/>
         </w:rPr>
-        <w:t xml:space="preserve">├── lib/</w:t>
+        <w:t xml:space="preserve">│   └── upload/FileUploader.tsx   # Componente de carga de archivos</w:t>
       </w:r>
     </w:p>
     <w:p>
@@ -8648,7 +10289,7 @@
           <w:sz w:val="18"/>
           <w:szCs w:val="18"/>
         </w:rPr>
-        <w:t xml:space="preserve">│   ├── anthropic/analyzer.ts     # Motor IA (prompts + override matematico)</w:t>
+        <w:t xml:space="preserve">│</w:t>
       </w:r>
     </w:p>
     <w:p>
@@ -8663,7 +10304,7 @@
           <w:sz w:val="18"/>
           <w:szCs w:val="18"/>
         </w:rPr>
-        <w:t xml:space="preserve">│   ├── longevity-scoring.ts      # Funciones sigmoideas por biomarcador (30+)</w:t>
+        <w:t xml:space="preserve">├── lib/</w:t>
       </w:r>
     </w:p>
     <w:p>
@@ -8678,7 +10319,7 @@
           <w:sz w:val="18"/>
           <w:szCs w:val="18"/>
         </w:rPr>
-        <w:t xml:space="preserve">│   ├── longevity-phenoage.ts     # Edad biologica PhenoAge (Levine 2018)</w:t>
+        <w:t xml:space="preserve">│   ├── anthropic/analyzer.ts     # Motor IA (prompts + override matematico)</w:t>
       </w:r>
     </w:p>
     <w:p>
@@ -8693,7 +10334,7 @@
           <w:sz w:val="18"/>
           <w:szCs w:val="18"/>
         </w:rPr>
-        <w:t xml:space="preserve">│   ├── longevity-foda.ts         # FODA computada (11 biomarcadores)</w:t>
+        <w:t xml:space="preserve">│   ├── longevity-scoring.ts      # Funciones sigmoideas por biomarcador (30+)</w:t>
       </w:r>
     </w:p>
     <w:p>
@@ -8708,7 +10349,7 @@
           <w:sz w:val="18"/>
           <w:szCs w:val="18"/>
         </w:rPr>
-        <w:t xml:space="preserve">│   ├── longevity-projection.ts   # Proyeccion Gompertz 10 anos</w:t>
+        <w:t xml:space="preserve">│   ├── longevity-phenoage.ts     # Edad biologica PhenoAge (Levine 2018)</w:t>
       </w:r>
     </w:p>
     <w:p>
@@ -8723,7 +10364,7 @@
           <w:sz w:val="18"/>
           <w:szCs w:val="18"/>
         </w:rPr>
-        <w:t xml:space="preserve">│   ├── longevity-wearables.ts    # Integracion wearables (13 metricas)</w:t>
+        <w:t xml:space="preserve">│   ├── longevity-foda.ts         # FODA computada (11 biomarcadores)</w:t>
       </w:r>
     </w:p>
     <w:p>
@@ -8738,7 +10379,7 @@
           <w:sz w:val="18"/>
           <w:szCs w:val="18"/>
         </w:rPr>
-        <w:t xml:space="preserve">│   ├── longevity-trends.ts       # Tendencias longitudinales entre analisis</w:t>
+        <w:t xml:space="preserve">│   ├── longevity-projection.ts   # Proyeccion Gompertz 10 anos</w:t>
       </w:r>
     </w:p>
     <w:p>
@@ -8753,7 +10394,7 @@
           <w:sz w:val="18"/>
           <w:szCs w:val="18"/>
         </w:rPr>
-        <w:t xml:space="preserve">│   ├── clinical-calculators.ts   # 8 calculadoras clinicas</w:t>
+        <w:t xml:space="preserve">│   ├── longevity-wearables.ts    # Integracion wearables (13 metricas)</w:t>
       </w:r>
     </w:p>
     <w:p>
@@ -8768,7 +10409,7 @@
           <w:sz w:val="18"/>
           <w:szCs w:val="18"/>
         </w:rPr>
-        <w:t xml:space="preserve">│   ├── medical-references.ts     # PubMed + Semantic Scholar + OpenAlex</w:t>
+        <w:t xml:space="preserve">│   ├── longevity-trends.ts       # Tendencias longitudinales entre analisis</w:t>
       </w:r>
     </w:p>
     <w:p>
@@ -8783,7 +10424,7 @@
           <w:sz w:val="18"/>
           <w:szCs w:val="18"/>
         </w:rPr>
-        <w:t xml:space="preserve">│   ├── biomarker-ranges.ts       # Catalogo de 133 biomarcadores</w:t>
+        <w:t xml:space="preserve">│   ├── clinical-calculators.ts   # 8 calculadoras clinicas</w:t>
       </w:r>
     </w:p>
     <w:p>
@@ -8798,7 +10439,67 @@
           <w:sz w:val="18"/>
           <w:szCs w:val="18"/>
         </w:rPr>
-        <w:t xml:space="preserve">│   ├── pdf-report.ts             # Generador de PDF programatico</w:t>
+        <w:t xml:space="preserve">│   ├── medical-references.ts     # PubMed + Semantic Scholar + OpenAlex</w:t>
+      </w:r>
+    </w:p>
+    <w:p>
+      <w:pPr>
+        <w:spacing w:after="20" w:before="20"/>
+        <w:ind w:left="400"/>
+      </w:pPr>
+      <w:r>
+        <w:rPr>
+          <w:rFonts w:ascii="Consolas" w:cs="Consolas" w:eastAsia="Consolas" w:hAnsi="Consolas"/>
+          <w:color w:val="6B6660"/>
+          <w:sz w:val="18"/>
+          <w:szCs w:val="18"/>
+        </w:rPr>
+        <w:t xml:space="preserve">│   ├── biomarker-ranges.ts       # Catalogo de 133 biomarcadores</w:t>
+      </w:r>
+    </w:p>
+    <w:p>
+      <w:pPr>
+        <w:spacing w:after="20" w:before="20"/>
+        <w:ind w:left="400"/>
+      </w:pPr>
+      <w:r>
+        <w:rPr>
+          <w:rFonts w:ascii="Consolas" w:cs="Consolas" w:eastAsia="Consolas" w:hAnsi="Consolas"/>
+          <w:color w:val="6B6660"/>
+          <w:sz w:val="18"/>
+          <w:szCs w:val="18"/>
+        </w:rPr>
+        <w:t xml:space="preserve">│   ├── pdf-report.ts             # Generador de PDF reporte medico</w:t>
+      </w:r>
+    </w:p>
+    <w:p>
+      <w:pPr>
+        <w:spacing w:after="20" w:before="20"/>
+        <w:ind w:left="400"/>
+      </w:pPr>
+      <w:r>
+        <w:rPr>
+          <w:rFonts w:ascii="Consolas" w:cs="Consolas" w:eastAsia="Consolas" w:hAnsi="Consolas"/>
+          <w:color w:val="6B6660"/>
+          <w:sz w:val="18"/>
+          <w:szCs w:val="18"/>
+        </w:rPr>
+        <w:t xml:space="preserve">│   ├── prescription-pdf.ts       # Generador de PDF prescripcion digital</w:t>
+      </w:r>
+    </w:p>
+    <w:p>
+      <w:pPr>
+        <w:spacing w:after="20" w:before="20"/>
+        <w:ind w:left="400"/>
+      </w:pPr>
+      <w:r>
+        <w:rPr>
+          <w:rFonts w:ascii="Consolas" w:cs="Consolas" w:eastAsia="Consolas" w:hAnsi="Consolas"/>
+          <w:color w:val="6B6660"/>
+          <w:sz w:val="18"/>
+          <w:szCs w:val="18"/>
+        </w:rPr>
+        <w:t xml:space="preserve">│   ├── generate-alerts.ts        # Generacion automatica de alertas para medicos</w:t>
       </w:r>
     </w:p>
     <w:p>
@@ -11750,7 +13451,7 @@
           <w:sz w:val="22"/>
           <w:szCs w:val="22"/>
         </w:rPr>
-        <w:t xml:space="preserve"> (v3.0)</w:t>
+        <w:t xml:space="preserve"> (v3.2)</w:t>
       </w:r>
     </w:p>
     <w:tbl>
@@ -12104,7 +13805,7 @@
                 <w:sz w:val="22"/>
                 <w:szCs w:val="22"/>
               </w:rPr>
-              <w:t xml:space="preserve">soap / follow_up / comment / protocol_adjustment</w:t>
+              <w:t xml:space="preserve">soap / comment / protocol_adjustment / diagnosis</w:t>
             </w:r>
           </w:p>
         </w:tc>
@@ -12348,6 +14049,174 @@
                 <w:sz w:val="22"/>
                 <w:szCs w:val="22"/>
               </w:rPr>
+              <w:t xml:space="preserve">content</w:t>
+            </w:r>
+          </w:p>
+        </w:tc>
+        <w:tc>
+          <w:tcPr>
+            <w:tcW w:type="dxa" w:w="3000"/>
+          </w:tcPr>
+          <w:p>
+            <w:pPr>
+              <w:spacing w:after="40" w:before="40"/>
+            </w:pPr>
+            <w:r>
+              <w:rPr>
+                <w:rFonts w:ascii="Calibri" w:cs="Calibri" w:eastAsia="Calibri" w:hAnsi="Calibri"/>
+                <w:sz w:val="22"/>
+                <w:szCs w:val="22"/>
+              </w:rPr>
+              <w:t xml:space="preserve">TEXT</w:t>
+            </w:r>
+          </w:p>
+        </w:tc>
+        <w:tc>
+          <w:tcPr>
+            <w:tcW w:type="dxa" w:w="3000"/>
+          </w:tcPr>
+          <w:p>
+            <w:pPr>
+              <w:spacing w:after="40" w:before="40"/>
+            </w:pPr>
+            <w:r>
+              <w:rPr>
+                <w:rFonts w:ascii="Calibri" w:cs="Calibri" w:eastAsia="Calibri" w:hAnsi="Calibri"/>
+                <w:sz w:val="22"/>
+                <w:szCs w:val="22"/>
+              </w:rPr>
+              <w:t xml:space="preserve">Nota libre / comentario de biomarcador</w:t>
+            </w:r>
+          </w:p>
+        </w:tc>
+      </w:tr>
+      <w:tr>
+        <w:tc>
+          <w:tcPr>
+            <w:tcW w:type="dxa" w:w="3000"/>
+          </w:tcPr>
+          <w:p>
+            <w:pPr>
+              <w:spacing w:after="40" w:before="40"/>
+            </w:pPr>
+            <w:r>
+              <w:rPr>
+                <w:rFonts w:ascii="Calibri" w:cs="Calibri" w:eastAsia="Calibri" w:hAnsi="Calibri"/>
+                <w:sz w:val="22"/>
+                <w:szCs w:val="22"/>
+              </w:rPr>
+              <w:t xml:space="preserve">biomarker_key</w:t>
+            </w:r>
+          </w:p>
+        </w:tc>
+        <w:tc>
+          <w:tcPr>
+            <w:tcW w:type="dxa" w:w="3000"/>
+          </w:tcPr>
+          <w:p>
+            <w:pPr>
+              <w:spacing w:after="40" w:before="40"/>
+            </w:pPr>
+            <w:r>
+              <w:rPr>
+                <w:rFonts w:ascii="Calibri" w:cs="Calibri" w:eastAsia="Calibri" w:hAnsi="Calibri"/>
+                <w:sz w:val="22"/>
+                <w:szCs w:val="22"/>
+              </w:rPr>
+              <w:t xml:space="preserve">TEXT</w:t>
+            </w:r>
+          </w:p>
+        </w:tc>
+        <w:tc>
+          <w:tcPr>
+            <w:tcW w:type="dxa" w:w="3000"/>
+          </w:tcPr>
+          <w:p>
+            <w:pPr>
+              <w:spacing w:after="40" w:before="40"/>
+            </w:pPr>
+            <w:r>
+              <w:rPr>
+                <w:rFonts w:ascii="Calibri" w:cs="Calibri" w:eastAsia="Calibri" w:hAnsi="Calibri"/>
+                <w:sz w:val="22"/>
+                <w:szCs w:val="22"/>
+              </w:rPr>
+              <w:t xml:space="preserve">Biomarcador especifico (ej: "lipids.ldl")</w:t>
+            </w:r>
+          </w:p>
+        </w:tc>
+      </w:tr>
+      <w:tr>
+        <w:tc>
+          <w:tcPr>
+            <w:tcW w:type="dxa" w:w="3000"/>
+          </w:tcPr>
+          <w:p>
+            <w:pPr>
+              <w:spacing w:after="40" w:before="40"/>
+            </w:pPr>
+            <w:r>
+              <w:rPr>
+                <w:rFonts w:ascii="Calibri" w:cs="Calibri" w:eastAsia="Calibri" w:hAnsi="Calibri"/>
+                <w:sz w:val="22"/>
+                <w:szCs w:val="22"/>
+              </w:rPr>
+              <w:t xml:space="preserve">protocol_adjustments</w:t>
+            </w:r>
+          </w:p>
+        </w:tc>
+        <w:tc>
+          <w:tcPr>
+            <w:tcW w:type="dxa" w:w="3000"/>
+          </w:tcPr>
+          <w:p>
+            <w:pPr>
+              <w:spacing w:after="40" w:before="40"/>
+            </w:pPr>
+            <w:r>
+              <w:rPr>
+                <w:rFonts w:ascii="Calibri" w:cs="Calibri" w:eastAsia="Calibri" w:hAnsi="Calibri"/>
+                <w:sz w:val="22"/>
+                <w:szCs w:val="22"/>
+              </w:rPr>
+              <w:t xml:space="preserve">JSONB</w:t>
+            </w:r>
+          </w:p>
+        </w:tc>
+        <w:tc>
+          <w:tcPr>
+            <w:tcW w:type="dxa" w:w="3000"/>
+          </w:tcPr>
+          <w:p>
+            <w:pPr>
+              <w:spacing w:after="40" w:before="40"/>
+            </w:pPr>
+            <w:r>
+              <w:rPr>
+                <w:rFonts w:ascii="Calibri" w:cs="Calibri" w:eastAsia="Calibri" w:hAnsi="Calibri"/>
+                <w:sz w:val="22"/>
+                <w:szCs w:val="22"/>
+              </w:rPr>
+              <w:t xml:space="preserve">[{molecule, action: approve/reject/modify, newDose, reason}]</w:t>
+            </w:r>
+          </w:p>
+        </w:tc>
+      </w:tr>
+      <w:tr>
+        <w:tc>
+          <w:tcPr>
+            <w:tcW w:type="dxa" w:w="3000"/>
+          </w:tcPr>
+          <w:p>
+            <w:pPr>
+              <w:spacing w:after="40" w:before="40"/>
+            </w:pPr>
+            <w:r>
+              <w:rPr>
+                <w:rFonts w:ascii="Calibri" w:cs="Calibri" w:eastAsia="Calibri" w:hAnsi="Calibri"/>
+                <w:sz w:val="22"/>
+                <w:szCs w:val="22"/>
+              </w:rPr>
               <w:t xml:space="preserve">diagnoses</w:t>
             </w:r>
           </w:p>
@@ -12384,7 +14253,7 @@
                 <w:sz w:val="22"/>
                 <w:szCs w:val="22"/>
               </w:rPr>
-              <w:t xml:space="preserve">Codigos CIE-10</w:t>
+              <w:t xml:space="preserve">Codigos CIE-10 (ej: ["E11", "E78.0", "I10"])</w:t>
             </w:r>
           </w:p>
         </w:tc>

</xml_diff>